<commit_message>
Add repository URL to documents
</commit_message>
<xml_diff>
--- a/EEI6373_MiniProject_Preliminary_Submission.docx
+++ b/EEI6373_MiniProject_Preliminary_Submission.docx
@@ -5,9 +5,7 @@
     <w:p>
       <w:pPr>
         <w:spacing w:after="40"/>
-        <w:jc w:val="center"/>
-      </w:pPr>
-      <w:r>
+        <w:jc w:val="both"/>
         <w:rPr>
           <w:b/>
           <w:bCs/>
@@ -15,32 +13,282 @@
           <w:sz w:val="22"/>
           <w:szCs w:val="22"/>
         </w:rPr>
-        <w:t>THE OPEN UNIVERSITY OF SRI LANKA</w:t>
-      </w:r>
+      </w:pPr>
     </w:p>
     <w:p>
       <w:pPr>
         <w:spacing w:after="40"/>
-        <w:jc w:val="center"/>
-      </w:pPr>
-      <w:r>
-        <w:rPr>
+        <w:jc w:val="both"/>
+        <w:rPr>
+          <w:b/>
+          <w:bCs/>
           <w:color w:val="595959"/>
-        </w:rPr>
-        <w:t>Department of Electrical &amp; Computer Engineering – Bachelor of Software Engineering</w:t>
-      </w:r>
+          <w:sz w:val="22"/>
+          <w:szCs w:val="22"/>
+        </w:rPr>
+      </w:pPr>
+    </w:p>
+    <w:p>
+      <w:pPr>
+        <w:spacing w:after="40"/>
+        <w:jc w:val="both"/>
+        <w:rPr>
+          <w:b/>
+          <w:bCs/>
+          <w:color w:val="595959"/>
+          <w:sz w:val="22"/>
+          <w:szCs w:val="22"/>
+        </w:rPr>
+      </w:pPr>
+    </w:p>
+    <w:p>
+      <w:pPr>
+        <w:spacing w:after="40"/>
+        <w:jc w:val="both"/>
+        <w:rPr>
+          <w:b/>
+          <w:bCs/>
+          <w:color w:val="595959"/>
+          <w:sz w:val="22"/>
+          <w:szCs w:val="22"/>
+        </w:rPr>
+      </w:pPr>
+    </w:p>
+    <w:p>
+      <w:pPr>
+        <w:spacing w:after="40"/>
+        <w:jc w:val="both"/>
+        <w:rPr>
+          <w:b/>
+          <w:bCs/>
+          <w:color w:val="595959"/>
+          <w:sz w:val="22"/>
+          <w:szCs w:val="22"/>
+        </w:rPr>
+      </w:pPr>
     </w:p>
     <w:p>
       <w:pPr>
         <w:spacing w:after="300"/>
         <w:jc w:val="center"/>
-      </w:pPr>
-      <w:r>
-        <w:rPr>
+        <w:rPr>
+          <w:b/>
+          <w:bCs/>
           <w:color w:val="595959"/>
+          <w:sz w:val="28"/>
+          <w:szCs w:val="28"/>
+          <w:lang w:val="en-GB"/>
+        </w:rPr>
+      </w:pPr>
+      <w:r>
+        <w:rPr>
+          <w:b/>
+          <w:bCs/>
+          <w:color w:val="595959"/>
+          <w:sz w:val="28"/>
+          <w:szCs w:val="28"/>
+          <w:lang w:val="en-GB"/>
+        </w:rPr>
+        <w:t>BACHELOR OF SOFTWARE ENGINEERING</w:t>
+      </w:r>
+    </w:p>
+    <w:p>
+      <w:pPr>
+        <w:spacing w:after="300"/>
+        <w:jc w:val="center"/>
+        <w:rPr>
+          <w:b/>
+          <w:bCs/>
+          <w:color w:val="595959"/>
+          <w:sz w:val="28"/>
+          <w:szCs w:val="28"/>
+          <w:lang w:val="en-GB"/>
+        </w:rPr>
+      </w:pPr>
+      <w:r>
+        <w:rPr>
+          <w:b/>
+          <w:bCs/>
+          <w:color w:val="595959"/>
+          <w:sz w:val="28"/>
+          <w:szCs w:val="28"/>
+          <w:lang w:val="en-GB"/>
+        </w:rPr>
+        <w:t>DEPARTMENT OF ELECTRICAL AND COMPUTER</w:t>
+      </w:r>
+    </w:p>
+    <w:p>
+      <w:pPr>
+        <w:spacing w:after="300"/>
+        <w:jc w:val="center"/>
+        <w:rPr>
+          <w:b/>
+          <w:bCs/>
+          <w:color w:val="595959"/>
+          <w:sz w:val="28"/>
+          <w:szCs w:val="28"/>
+          <w:lang w:val="en-GB"/>
+        </w:rPr>
+      </w:pPr>
+      <w:r>
+        <w:rPr>
+          <w:b/>
+          <w:bCs/>
+          <w:color w:val="595959"/>
+          <w:sz w:val="28"/>
+          <w:szCs w:val="28"/>
+          <w:lang w:val="en-GB"/>
+        </w:rPr>
+        <w:t>ENGINEERING</w:t>
+      </w:r>
+    </w:p>
+    <w:p>
+      <w:pPr>
+        <w:spacing w:after="300"/>
+        <w:jc w:val="center"/>
+        <w:rPr>
+          <w:b/>
+          <w:bCs/>
+          <w:color w:val="595959"/>
+          <w:sz w:val="28"/>
+          <w:szCs w:val="28"/>
+          <w:lang w:val="en-GB"/>
+        </w:rPr>
+      </w:pPr>
+      <w:r>
+        <w:rPr>
+          <w:b/>
+          <w:bCs/>
+          <w:color w:val="595959"/>
+          <w:sz w:val="28"/>
+          <w:szCs w:val="28"/>
+          <w:lang w:val="en-GB"/>
+        </w:rPr>
+        <w:t xml:space="preserve"> </w:t>
+      </w:r>
+      <w:r>
+        <w:rPr>
+          <w:noProof/>
+        </w:rPr>
+        <w:drawing>
+          <wp:inline distT="0" distB="0" distL="0" distR="0" wp14:anchorId="75BFA6E0" wp14:editId="5471CBB8">
+            <wp:extent cx="1498600" cy="1943100"/>
+            <wp:effectExtent l="0" t="0" r="6350" b="0"/>
+            <wp:docPr id="1276530141" name="Picture 1"/>
+            <wp:cNvGraphicFramePr>
+              <a:graphicFrameLocks xmlns:a="http://schemas.openxmlformats.org/drawingml/2006/main" noChangeAspect="1"/>
+            </wp:cNvGraphicFramePr>
+            <a:graphic xmlns:a="http://schemas.openxmlformats.org/drawingml/2006/main">
+              <a:graphicData uri="http://schemas.openxmlformats.org/drawingml/2006/picture">
+                <pic:pic xmlns:pic="http://schemas.openxmlformats.org/drawingml/2006/picture">
+                  <pic:nvPicPr>
+                    <pic:cNvPr id="1276530141" name="Picture 1"/>
+                    <pic:cNvPicPr>
+                      <a:picLocks noChangeAspect="1"/>
+                    </pic:cNvPicPr>
+                  </pic:nvPicPr>
+                  <pic:blipFill>
+                    <a:blip r:embed="rId7">
+                      <a:extLst>
+                        <a:ext uri="{28A0092B-C50C-407E-A947-70E740481C1C}">
+                          <a14:useLocalDpi xmlns:a14="http://schemas.microsoft.com/office/drawing/2010/main" val="0"/>
+                        </a:ext>
+                      </a:extLst>
+                    </a:blip>
+                    <a:stretch>
+                      <a:fillRect/>
+                    </a:stretch>
+                  </pic:blipFill>
+                  <pic:spPr>
+                    <a:xfrm>
+                      <a:off x="0" y="0"/>
+                      <a:ext cx="1498600" cy="1943100"/>
+                    </a:xfrm>
+                    <a:prstGeom prst="rect">
+                      <a:avLst/>
+                    </a:prstGeom>
+                  </pic:spPr>
+                </pic:pic>
+              </a:graphicData>
+            </a:graphic>
+          </wp:inline>
+        </w:drawing>
+      </w:r>
+    </w:p>
+    <w:p>
+      <w:pPr>
+        <w:spacing w:after="300"/>
+        <w:jc w:val="center"/>
+        <w:rPr>
+          <w:b/>
+          <w:bCs/>
+          <w:color w:val="595959"/>
+          <w:sz w:val="28"/>
+          <w:szCs w:val="28"/>
+          <w:lang w:val="en-GB"/>
+        </w:rPr>
+      </w:pPr>
+      <w:r>
+        <w:rPr>
+          <w:b/>
+          <w:bCs/>
+          <w:color w:val="595959"/>
+          <w:sz w:val="28"/>
+          <w:szCs w:val="28"/>
+          <w:lang w:val="en-GB"/>
+        </w:rPr>
+        <w:t>THE OPEN UNIVERSITY OF</w:t>
+      </w:r>
+    </w:p>
+    <w:p>
+      <w:pPr>
+        <w:spacing w:after="300"/>
+        <w:jc w:val="center"/>
+        <w:rPr>
+          <w:b/>
+          <w:bCs/>
+          <w:color w:val="595959"/>
+          <w:sz w:val="28"/>
+          <w:szCs w:val="28"/>
+          <w:lang w:val="en-GB"/>
+        </w:rPr>
+      </w:pPr>
+      <w:r>
+        <w:rPr>
+          <w:b/>
+          <w:bCs/>
+          <w:color w:val="595959"/>
+          <w:sz w:val="28"/>
+          <w:szCs w:val="28"/>
+          <w:lang w:val="en-GB"/>
+        </w:rPr>
+        <w:t>SRILANKA</w:t>
+      </w:r>
+    </w:p>
+    <w:p>
+      <w:pPr>
+        <w:spacing w:after="300"/>
+        <w:jc w:val="center"/>
+        <w:rPr>
+          <w:color w:val="595959"/>
+          <w:sz w:val="24"/>
+          <w:szCs w:val="24"/>
+        </w:rPr>
+      </w:pPr>
+      <w:r>
+        <w:rPr>
+          <w:color w:val="595959"/>
+          <w:sz w:val="24"/>
+          <w:szCs w:val="24"/>
         </w:rPr>
         <w:t>EEI6373 – Performance Modelling</w:t>
       </w:r>
+    </w:p>
+    <w:p>
+      <w:pPr>
+        <w:spacing w:after="300"/>
+        <w:jc w:val="center"/>
+      </w:pPr>
     </w:p>
     <w:p>
       <w:pPr>
@@ -75,7 +323,10 @@
     <w:p>
       <w:pPr>
         <w:spacing w:before="400" w:after="40"/>
-        <w:jc w:val="center"/>
+        <w:rPr>
+          <w:sz w:val="24"/>
+          <w:szCs w:val="24"/>
+        </w:rPr>
       </w:pPr>
       <w:r>
         <w:rPr>
@@ -84,8 +335,8 @@
           <w:i/>
           <w:iCs/>
           <w:color w:val="262626"/>
-          <w:sz w:val="24"/>
-          <w:szCs w:val="24"/>
+          <w:sz w:val="32"/>
+          <w:szCs w:val="32"/>
         </w:rPr>
         <w:t>Invoice Approval Processing Queue in a Web-Based ERP System</w:t>
       </w:r>
@@ -94,37 +345,321 @@
       <w:pPr>
         <w:spacing w:before="600" w:after="20"/>
         <w:jc w:val="center"/>
-      </w:pPr>
-      <w:r>
-        <w:rPr>
-          <w:color w:val="262626"/>
-        </w:rPr>
-        <w:t xml:space="preserve">Prepared by: Afri </w:t>
+        <w:rPr>
+          <w:color w:val="262626"/>
+          <w:sz w:val="32"/>
+          <w:szCs w:val="32"/>
+        </w:rPr>
+      </w:pPr>
+    </w:p>
+    <w:p>
+      <w:pPr>
+        <w:rPr>
+          <w:b/>
+          <w:bCs/>
+          <w:sz w:val="32"/>
+          <w:szCs w:val="32"/>
+          <w:lang w:val="en-GB"/>
+        </w:rPr>
+      </w:pPr>
+      <w:r>
+        <w:rPr>
+          <w:b/>
+          <w:bCs/>
+          <w:sz w:val="32"/>
+          <w:szCs w:val="32"/>
+          <w:lang w:val="en-GB"/>
+        </w:rPr>
+        <w:t>M. AFRI AHMATH</w:t>
+      </w:r>
+    </w:p>
+    <w:p>
+      <w:pPr>
+        <w:rPr>
+          <w:b/>
+          <w:bCs/>
+          <w:sz w:val="32"/>
+          <w:szCs w:val="32"/>
+          <w:lang w:val="en-GB"/>
+        </w:rPr>
+      </w:pPr>
+      <w:r>
+        <w:rPr>
+          <w:b/>
+          <w:bCs/>
+          <w:sz w:val="32"/>
+          <w:szCs w:val="32"/>
+          <w:lang w:val="en-GB"/>
+        </w:rPr>
+        <w:t xml:space="preserve">S </w:t>
+      </w:r>
+      <w:proofErr w:type="gramStart"/>
+      <w:r>
+        <w:rPr>
+          <w:b/>
+          <w:bCs/>
+          <w:sz w:val="32"/>
+          <w:szCs w:val="32"/>
+          <w:lang w:val="en-GB"/>
+        </w:rPr>
+        <w:t>ID:-</w:t>
+      </w:r>
+      <w:proofErr w:type="gramEnd"/>
+      <w:r>
+        <w:rPr>
+          <w:b/>
+          <w:bCs/>
+          <w:sz w:val="32"/>
+          <w:szCs w:val="32"/>
+          <w:lang w:val="en-GB"/>
+        </w:rPr>
+        <w:t xml:space="preserve"> </w:t>
+      </w:r>
+      <w:r>
+        <w:rPr>
+          <w:b/>
+          <w:bCs/>
+          <w:sz w:val="32"/>
+          <w:szCs w:val="32"/>
+          <w:lang w:val="en-GB"/>
+        </w:rPr>
+        <w:t>S92075094</w:t>
+      </w:r>
+    </w:p>
+    <w:p>
+      <w:pPr>
+        <w:rPr>
+          <w:b/>
+          <w:bCs/>
+          <w:sz w:val="32"/>
+          <w:szCs w:val="32"/>
+          <w:lang w:val="en-GB"/>
+        </w:rPr>
+      </w:pPr>
+      <w:r>
+        <w:rPr>
+          <w:b/>
+          <w:bCs/>
+          <w:sz w:val="32"/>
+          <w:szCs w:val="32"/>
+          <w:lang w:val="en-GB"/>
+        </w:rPr>
+        <w:t xml:space="preserve">REG </w:t>
+      </w:r>
+      <w:proofErr w:type="gramStart"/>
+      <w:r>
+        <w:rPr>
+          <w:b/>
+          <w:bCs/>
+          <w:sz w:val="32"/>
+          <w:szCs w:val="32"/>
+          <w:lang w:val="en-GB"/>
+        </w:rPr>
+        <w:t>NO:-</w:t>
+      </w:r>
+      <w:proofErr w:type="gramEnd"/>
+      <w:r>
+        <w:rPr>
+          <w:b/>
+          <w:bCs/>
+          <w:sz w:val="32"/>
+          <w:szCs w:val="32"/>
+          <w:lang w:val="en-GB"/>
+        </w:rPr>
+        <w:t xml:space="preserve"> </w:t>
+      </w:r>
+      <w:r>
+        <w:rPr>
+          <w:b/>
+          <w:bCs/>
+          <w:sz w:val="32"/>
+          <w:szCs w:val="32"/>
+          <w:lang w:val="en-GB"/>
+        </w:rPr>
+        <w:t>121435094</w:t>
+      </w:r>
+    </w:p>
+    <w:p/>
+    <w:p/>
+    <w:p/>
+    <w:p/>
+    <w:p/>
+    <w:p/>
+    <w:p/>
+    <w:p>
+      <w:pPr>
+        <w:pStyle w:val="Heading1"/>
+        <w:pBdr>
+          <w:bottom w:val="single" w:sz="6" w:space="0" w:color="0E7C7B"/>
+        </w:pBdr>
+        <w:spacing w:before="320" w:after="160"/>
+        <w:jc w:val="both"/>
+        <w:rPr>
+          <w:b/>
+          <w:bCs/>
+          <w:color w:val="1F3864"/>
+          <w:sz w:val="28"/>
+          <w:szCs w:val="28"/>
+        </w:rPr>
+      </w:pPr>
+      <w:r>
+        <w:rPr>
+          <w:b/>
+          <w:bCs/>
+          <w:color w:val="1F3864"/>
+          <w:sz w:val="28"/>
+          <w:szCs w:val="28"/>
+        </w:rPr>
+        <w:lastRenderedPageBreak/>
+        <w:t>1. System Description</w:t>
+      </w:r>
+    </w:p>
+    <w:p>
+      <w:pPr>
+        <w:pStyle w:val="Heading1"/>
+        <w:pBdr>
+          <w:bottom w:val="single" w:sz="6" w:space="0" w:color="0E7C7B"/>
+        </w:pBdr>
+        <w:spacing w:before="320" w:after="160"/>
+        <w:jc w:val="both"/>
+        <w:rPr>
+          <w:color w:val="262626"/>
+          <w:sz w:val="22"/>
+          <w:szCs w:val="22"/>
+        </w:rPr>
+      </w:pPr>
+      <w:r>
+        <w:rPr>
+          <w:color w:val="262626"/>
+          <w:sz w:val="22"/>
+          <w:szCs w:val="22"/>
+        </w:rPr>
+        <w:t>The system selected for this mini project is the invoice approval processing queue operating within a web-based distributor Enterprise Resource Planning (ERP) system used by a fast-moving consumer goods (FMCG) distribution business. This system was chosen because I have first-hand exposure to it through prior automation work on distributor loading and invoice approval bots built for the same ERP platform, which gives me practical insight into its real operating patterns, bottlenecks, and staffing structure.</w:t>
+      </w:r>
+    </w:p>
+    <w:p>
+      <w:pPr>
+        <w:pStyle w:val="Heading1"/>
+        <w:pBdr>
+          <w:bottom w:val="single" w:sz="6" w:space="0" w:color="0E7C7B"/>
+        </w:pBdr>
+        <w:spacing w:before="320" w:after="160"/>
+        <w:jc w:val="both"/>
+        <w:rPr>
+          <w:color w:val="262626"/>
+          <w:sz w:val="22"/>
+          <w:szCs w:val="22"/>
+        </w:rPr>
+      </w:pPr>
+      <w:r>
+        <w:rPr>
+          <w:color w:val="262626"/>
+          <w:sz w:val="22"/>
+          <w:szCs w:val="22"/>
+        </w:rPr>
+        <w:t xml:space="preserve">Invoices are generated when distributors submit goods-received or sales documentation into the ERP. Each invoice must pass through a two-stage human approval workflow before it is </w:t>
       </w:r>
       <w:proofErr w:type="spellStart"/>
       <w:r>
         <w:rPr>
           <w:color w:val="262626"/>
-        </w:rPr>
-        <w:t>Ahmath</w:t>
+          <w:sz w:val="22"/>
+          <w:szCs w:val="22"/>
+        </w:rPr>
+        <w:t>finalised</w:t>
       </w:r>
       <w:proofErr w:type="spellEnd"/>
-    </w:p>
-    <w:p>
-      <w:pPr>
-        <w:spacing w:after="20"/>
-        <w:jc w:val="center"/>
-      </w:pPr>
-      <w:r>
-        <w:rPr>
-          <w:color w:val="262626"/>
-        </w:rPr>
-        <w:t>Date: 08 August 2026</w:t>
-      </w:r>
-    </w:p>
-    <w:p>
-      <w:r>
-        <w:br w:type="page"/>
+      <w:r>
+        <w:rPr>
+          <w:color w:val="262626"/>
+          <w:sz w:val="22"/>
+          <w:szCs w:val="22"/>
+        </w:rPr>
+        <w:t xml:space="preserve"> in the system:</w:t>
+      </w:r>
+    </w:p>
+    <w:p>
+      <w:pPr>
+        <w:pStyle w:val="ListParagraph"/>
+        <w:numPr>
+          <w:ilvl w:val="0"/>
+          <w:numId w:val="1"/>
+        </w:numPr>
+        <w:spacing w:after="80"/>
+        <w:jc w:val="both"/>
+      </w:pPr>
+      <w:r>
+        <w:rPr>
+          <w:color w:val="262626"/>
+          <w:sz w:val="22"/>
+          <w:szCs w:val="22"/>
+        </w:rPr>
+        <w:t>Stage 1 – Initial Review: A branch-level reviewer checks the invoice for completeness, pricing accuracy, and stock reconciliation against the distributor's submission.</w:t>
+      </w:r>
+    </w:p>
+    <w:p>
+      <w:pPr>
+        <w:pStyle w:val="ListParagraph"/>
+        <w:numPr>
+          <w:ilvl w:val="0"/>
+          <w:numId w:val="1"/>
+        </w:numPr>
+        <w:spacing w:after="80"/>
+        <w:jc w:val="both"/>
+      </w:pPr>
+      <w:r>
+        <w:rPr>
+          <w:color w:val="262626"/>
+          <w:sz w:val="22"/>
+          <w:szCs w:val="22"/>
+        </w:rPr>
+        <w:t>Stage 2 – Manager Approval: A finance/operations manager gives final sign-off before the invoice is posted to the accounting ledger.</w:t>
+      </w:r>
+    </w:p>
+    <w:p>
+      <w:pPr>
+        <w:spacing w:after="160" w:line="288" w:lineRule="auto"/>
+        <w:jc w:val="both"/>
+      </w:pPr>
+      <w:r>
+        <w:rPr>
+          <w:color w:val="262626"/>
+          <w:sz w:val="22"/>
+          <w:szCs w:val="22"/>
+        </w:rPr>
+        <w:t>An invoice may be returned to the distributor after Stage 1 if discrepancies are found, or rejected after Stage 2 if the manager identifies an issue the reviewer missed. Only invoices that clear both stages are marked “Approved” and posted. Multiple reviewers and managers operate as parallel servers at each stage, so this is best modelled as a two-stage, multi-server tandem queuing network.</w:t>
+      </w:r>
+    </w:p>
+    <w:p>
+      <w:pPr>
+        <w:spacing w:after="160" w:line="288" w:lineRule="auto"/>
+        <w:jc w:val="both"/>
+      </w:pPr>
+      <w:r>
+        <w:rPr>
+          <w:color w:val="262626"/>
+          <w:sz w:val="22"/>
+          <w:szCs w:val="22"/>
+        </w:rPr>
+        <w:t>The system exhibits realistic, measurable performance characteristics: invoices arrive at a variable rate throughout the working day and spike sharply near month-end (when distributors rush to close outstanding accounts), while the number of reviewers and managers on duty is fixed. This creates natural congestion, queueing delay, and resource-</w:t>
+      </w:r>
+      <w:proofErr w:type="spellStart"/>
+      <w:r>
+        <w:rPr>
+          <w:color w:val="262626"/>
+          <w:sz w:val="22"/>
+          <w:szCs w:val="22"/>
+        </w:rPr>
+        <w:t>utilisation</w:t>
+      </w:r>
+      <w:proofErr w:type="spellEnd"/>
+      <w:r>
+        <w:rPr>
+          <w:color w:val="262626"/>
+          <w:sz w:val="22"/>
+          <w:szCs w:val="22"/>
+        </w:rPr>
+        <w:t xml:space="preserve"> effects that are well suited to formal performance modelling — satisfying the “complex enough” requirement of the assignment brief.</w:t>
       </w:r>
     </w:p>
     <w:p>
@@ -134,8 +669,7 @@
           <w:bottom w:val="single" w:sz="6" w:space="4" w:color="0E7C7B"/>
         </w:pBdr>
         <w:spacing w:before="320" w:after="160"/>
-      </w:pPr>
-      <w:r>
+        <w:jc w:val="both"/>
         <w:rPr>
           <w:b/>
           <w:bCs/>
@@ -143,136 +677,16 @@
           <w:sz w:val="28"/>
           <w:szCs w:val="28"/>
         </w:rPr>
-        <w:lastRenderedPageBreak/>
-        <w:t>1. System Description</w:t>
-      </w:r>
-    </w:p>
-    <w:p>
-      <w:pPr>
-        <w:spacing w:after="160" w:line="288" w:lineRule="auto"/>
-        <w:jc w:val="both"/>
-      </w:pPr>
-      <w:r>
-        <w:rPr>
-          <w:color w:val="262626"/>
-          <w:sz w:val="22"/>
-          <w:szCs w:val="22"/>
-        </w:rPr>
-        <w:t>The system selected for this mini project is the invoice approval processing queue operating within a web-based distributor Enterprise Resource Planning (ERP) system used by a fast-moving consumer goods (FMCG) distribution business. This system was chosen because I have first-hand exposure to it through prior automation work on distributor loading and invoice approval bots built for the same ERP platform, which gives me practical insight into its real operating patterns, bottlenecks, and staffing structure.</w:t>
-      </w:r>
-    </w:p>
-    <w:p>
-      <w:pPr>
-        <w:spacing w:after="160" w:line="288" w:lineRule="auto"/>
-        <w:jc w:val="both"/>
-      </w:pPr>
-      <w:r>
-        <w:rPr>
-          <w:color w:val="262626"/>
-          <w:sz w:val="22"/>
-          <w:szCs w:val="22"/>
-        </w:rPr>
-        <w:t xml:space="preserve">Invoices are generated when distributors submit goods-received or sales documentation into the ERP. Each invoice must pass through a two-stage human approval workflow before it is </w:t>
-      </w:r>
-      <w:proofErr w:type="spellStart"/>
-      <w:r>
-        <w:rPr>
-          <w:color w:val="262626"/>
-          <w:sz w:val="22"/>
-          <w:szCs w:val="22"/>
-        </w:rPr>
-        <w:t>finalised</w:t>
-      </w:r>
-      <w:proofErr w:type="spellEnd"/>
-      <w:r>
-        <w:rPr>
-          <w:color w:val="262626"/>
-          <w:sz w:val="22"/>
-          <w:szCs w:val="22"/>
-        </w:rPr>
-        <w:t xml:space="preserve"> in the system:</w:t>
-      </w:r>
-    </w:p>
-    <w:p>
-      <w:pPr>
-        <w:pStyle w:val="ListParagraph"/>
-        <w:numPr>
-          <w:ilvl w:val="0"/>
-          <w:numId w:val="2"/>
-        </w:numPr>
-        <w:spacing w:after="80"/>
-      </w:pPr>
-      <w:r>
-        <w:rPr>
-          <w:color w:val="262626"/>
-          <w:sz w:val="22"/>
-          <w:szCs w:val="22"/>
-        </w:rPr>
-        <w:t>Stage 1 – Initial Review: A branch-level reviewer checks the invoice for completeness, pricing accuracy, and stock reconciliation against the distributor's submission.</w:t>
-      </w:r>
-    </w:p>
-    <w:p>
-      <w:pPr>
-        <w:pStyle w:val="ListParagraph"/>
-        <w:numPr>
-          <w:ilvl w:val="0"/>
-          <w:numId w:val="2"/>
-        </w:numPr>
-        <w:spacing w:after="80"/>
-      </w:pPr>
-      <w:r>
-        <w:rPr>
-          <w:color w:val="262626"/>
-          <w:sz w:val="22"/>
-          <w:szCs w:val="22"/>
-        </w:rPr>
-        <w:t>Stage 2 – Manager Approval: A finance/operations manager gives final sign-off before the invoice is posted to the accounting ledger.</w:t>
-      </w:r>
-    </w:p>
-    <w:p>
-      <w:pPr>
-        <w:spacing w:after="160" w:line="288" w:lineRule="auto"/>
-        <w:jc w:val="both"/>
-      </w:pPr>
-      <w:r>
-        <w:rPr>
-          <w:color w:val="262626"/>
-          <w:sz w:val="22"/>
-          <w:szCs w:val="22"/>
-        </w:rPr>
-        <w:t>An invoice may be returned to the distributor after Stage 1 if discrepancies are found, or rejected after Stage 2 if the manager identifies an issue the reviewer missed. Only invoices that clear both stages are marked “Approved” and posted. Multiple reviewers and managers operate as parallel servers at each stage, so this is best modelled as a two-stage, multi-server tandem queuing network.</w:t>
-      </w:r>
-    </w:p>
-    <w:p>
-      <w:pPr>
-        <w:spacing w:after="160" w:line="288" w:lineRule="auto"/>
-        <w:jc w:val="both"/>
-      </w:pPr>
-      <w:r>
-        <w:rPr>
-          <w:color w:val="262626"/>
-          <w:sz w:val="22"/>
-          <w:szCs w:val="22"/>
-        </w:rPr>
-        <w:t>The system exhibits realistic, measurable performance characteristics: invoices arrive at a variable rate throughout the working day and spike sharply near month-end (when distributors rush to close outstanding accounts), while the number of reviewers and managers on duty is fixed. This creates natural congestion, queueing delay, and resource-</w:t>
-      </w:r>
-      <w:proofErr w:type="spellStart"/>
-      <w:r>
-        <w:rPr>
-          <w:color w:val="262626"/>
-          <w:sz w:val="22"/>
-          <w:szCs w:val="22"/>
-        </w:rPr>
-        <w:t>utilisation</w:t>
-      </w:r>
-      <w:proofErr w:type="spellEnd"/>
-      <w:r>
-        <w:rPr>
-          <w:color w:val="262626"/>
-          <w:sz w:val="22"/>
-          <w:szCs w:val="22"/>
-        </w:rPr>
-        <w:t xml:space="preserve"> effects that are well suited to formal performance modelling — satisfying the “complex enough” requirement of the assignment brief.</w:t>
+      </w:pPr>
+      <w:r>
+        <w:rPr>
+          <w:b/>
+          <w:bCs/>
+          <w:color w:val="1F3864"/>
+          <w:sz w:val="28"/>
+          <w:szCs w:val="28"/>
+        </w:rPr>
+        <w:t>2. Performance Objectives</w:t>
       </w:r>
     </w:p>
     <w:p>
@@ -282,6 +696,259 @@
           <w:bottom w:val="single" w:sz="6" w:space="4" w:color="0E7C7B"/>
         </w:pBdr>
         <w:spacing w:before="320" w:after="160"/>
+        <w:jc w:val="both"/>
+      </w:pPr>
+      <w:r>
+        <w:rPr>
+          <w:color w:val="262626"/>
+          <w:sz w:val="22"/>
+          <w:szCs w:val="22"/>
+        </w:rPr>
+        <w:t>The performance modelling and evaluation in the final report will focus on the following objectives:</w:t>
+      </w:r>
+    </w:p>
+    <w:p>
+      <w:pPr>
+        <w:pStyle w:val="ListParagraph"/>
+        <w:numPr>
+          <w:ilvl w:val="0"/>
+          <w:numId w:val="1"/>
+        </w:numPr>
+        <w:spacing w:after="80"/>
+        <w:jc w:val="both"/>
+      </w:pPr>
+      <w:proofErr w:type="spellStart"/>
+      <w:r>
+        <w:rPr>
+          <w:color w:val="262626"/>
+          <w:sz w:val="22"/>
+          <w:szCs w:val="22"/>
+        </w:rPr>
+        <w:t>Minimise</w:t>
+      </w:r>
+      <w:proofErr w:type="spellEnd"/>
+      <w:r>
+        <w:rPr>
+          <w:color w:val="262626"/>
+          <w:sz w:val="22"/>
+          <w:szCs w:val="22"/>
+        </w:rPr>
+        <w:t xml:space="preserve"> average invoice turnaround time – the total elapsed time from submission to final Approved/Rejected/Returned status.</w:t>
+      </w:r>
+    </w:p>
+    <w:p>
+      <w:pPr>
+        <w:pStyle w:val="ListParagraph"/>
+        <w:numPr>
+          <w:ilvl w:val="0"/>
+          <w:numId w:val="1"/>
+        </w:numPr>
+        <w:spacing w:after="80"/>
+        <w:jc w:val="both"/>
+      </w:pPr>
+      <w:r>
+        <w:rPr>
+          <w:color w:val="262626"/>
+          <w:sz w:val="22"/>
+          <w:szCs w:val="22"/>
+        </w:rPr>
+        <w:t>Identify the bottleneck stage – determine whether Initial Review or Manager Approval contributes more to overall delay, and under what load conditions this shifts.</w:t>
+      </w:r>
+    </w:p>
+    <w:p>
+      <w:pPr>
+        <w:pStyle w:val="ListParagraph"/>
+        <w:numPr>
+          <w:ilvl w:val="0"/>
+          <w:numId w:val="1"/>
+        </w:numPr>
+        <w:spacing w:after="80"/>
+        <w:jc w:val="both"/>
+      </w:pPr>
+      <w:r>
+        <w:rPr>
+          <w:color w:val="262626"/>
+          <w:sz w:val="22"/>
+          <w:szCs w:val="22"/>
+        </w:rPr>
+        <w:t xml:space="preserve">Measure resource (approver) </w:t>
+      </w:r>
+      <w:proofErr w:type="spellStart"/>
+      <w:r>
+        <w:rPr>
+          <w:color w:val="262626"/>
+          <w:sz w:val="22"/>
+          <w:szCs w:val="22"/>
+        </w:rPr>
+        <w:t>utilisation</w:t>
+      </w:r>
+      <w:proofErr w:type="spellEnd"/>
+      <w:r>
+        <w:rPr>
+          <w:color w:val="262626"/>
+          <w:sz w:val="22"/>
+          <w:szCs w:val="22"/>
+        </w:rPr>
+        <w:t xml:space="preserve"> – quantify how busy reviewers and managers are individually and as a pool, to detect over- or under-staffing.</w:t>
+      </w:r>
+    </w:p>
+    <w:p>
+      <w:pPr>
+        <w:pStyle w:val="ListParagraph"/>
+        <w:numPr>
+          <w:ilvl w:val="0"/>
+          <w:numId w:val="1"/>
+        </w:numPr>
+        <w:spacing w:after="80"/>
+        <w:jc w:val="both"/>
+      </w:pPr>
+      <w:proofErr w:type="spellStart"/>
+      <w:r>
+        <w:rPr>
+          <w:color w:val="262626"/>
+          <w:sz w:val="22"/>
+          <w:szCs w:val="22"/>
+        </w:rPr>
+        <w:t>Analyse</w:t>
+      </w:r>
+      <w:proofErr w:type="spellEnd"/>
+      <w:r>
+        <w:rPr>
+          <w:color w:val="262626"/>
+          <w:sz w:val="22"/>
+          <w:szCs w:val="22"/>
+        </w:rPr>
+        <w:t xml:space="preserve"> throughput under peak load – specifically the month-end surge period, when invoice arrival rates rise sharply compared to normal business days.</w:t>
+      </w:r>
+    </w:p>
+    <w:p>
+      <w:pPr>
+        <w:pStyle w:val="ListParagraph"/>
+        <w:numPr>
+          <w:ilvl w:val="0"/>
+          <w:numId w:val="1"/>
+        </w:numPr>
+        <w:spacing w:after="80"/>
+        <w:jc w:val="both"/>
+      </w:pPr>
+      <w:r>
+        <w:rPr>
+          <w:color w:val="262626"/>
+          <w:sz w:val="22"/>
+          <w:szCs w:val="22"/>
+        </w:rPr>
+        <w:t>Assess scalability – estimate how the system would behave if invoice volume doubled, or if an additional reviewer/manager were added, using the queuing model as a what-if tool.</w:t>
+      </w:r>
+    </w:p>
+    <w:p>
+      <w:pPr>
+        <w:spacing w:after="160" w:line="288" w:lineRule="auto"/>
+        <w:jc w:val="both"/>
+        <w:rPr>
+          <w:color w:val="262626"/>
+          <w:sz w:val="22"/>
+          <w:szCs w:val="22"/>
+        </w:rPr>
+      </w:pPr>
+      <w:r>
+        <w:rPr>
+          <w:color w:val="262626"/>
+          <w:sz w:val="22"/>
+          <w:szCs w:val="22"/>
+        </w:rPr>
+        <w:t>These objectives map directly onto standard performance metrics used in queuing analysis: mean waiting time (</w:t>
+      </w:r>
+      <w:proofErr w:type="spellStart"/>
+      <w:r>
+        <w:rPr>
+          <w:color w:val="262626"/>
+          <w:sz w:val="22"/>
+          <w:szCs w:val="22"/>
+        </w:rPr>
+        <w:t>Wq</w:t>
+      </w:r>
+      <w:proofErr w:type="spellEnd"/>
+      <w:r>
+        <w:rPr>
+          <w:color w:val="262626"/>
+          <w:sz w:val="22"/>
+          <w:szCs w:val="22"/>
+        </w:rPr>
+        <w:t xml:space="preserve">), mean time in system (W), server </w:t>
+      </w:r>
+      <w:proofErr w:type="spellStart"/>
+      <w:r>
+        <w:rPr>
+          <w:color w:val="262626"/>
+          <w:sz w:val="22"/>
+          <w:szCs w:val="22"/>
+        </w:rPr>
+        <w:t>utilisation</w:t>
+      </w:r>
+      <w:proofErr w:type="spellEnd"/>
+      <w:r>
+        <w:rPr>
+          <w:color w:val="262626"/>
+          <w:sz w:val="22"/>
+          <w:szCs w:val="22"/>
+        </w:rPr>
+        <w:t xml:space="preserve"> (ρ = λ/(</w:t>
+      </w:r>
+      <w:proofErr w:type="spellStart"/>
+      <w:r>
+        <w:rPr>
+          <w:color w:val="262626"/>
+          <w:sz w:val="22"/>
+          <w:szCs w:val="22"/>
+        </w:rPr>
+        <w:t>c·μ</w:t>
+      </w:r>
+      <w:proofErr w:type="spellEnd"/>
+      <w:r>
+        <w:rPr>
+          <w:color w:val="262626"/>
+          <w:sz w:val="22"/>
+          <w:szCs w:val="22"/>
+        </w:rPr>
+        <w:t>)), and throughput (λ effective), which will be estimated from the dataset described below and compared against an analytical multi-server queuing model (M/M/c) in the final submission.</w:t>
+      </w:r>
+    </w:p>
+    <w:p>
+      <w:pPr>
+        <w:spacing w:after="160" w:line="288" w:lineRule="auto"/>
+        <w:jc w:val="both"/>
+        <w:rPr>
+          <w:color w:val="262626"/>
+          <w:sz w:val="22"/>
+          <w:szCs w:val="22"/>
+        </w:rPr>
+      </w:pPr>
+    </w:p>
+    <w:p>
+      <w:pPr>
+        <w:spacing w:after="160" w:line="288" w:lineRule="auto"/>
+        <w:jc w:val="both"/>
+        <w:rPr>
+          <w:color w:val="262626"/>
+          <w:sz w:val="22"/>
+          <w:szCs w:val="22"/>
+        </w:rPr>
+      </w:pPr>
+    </w:p>
+    <w:p>
+      <w:pPr>
+        <w:spacing w:after="160" w:line="288" w:lineRule="auto"/>
+        <w:jc w:val="both"/>
+      </w:pPr>
+    </w:p>
+    <w:p>
+      <w:pPr>
+        <w:pStyle w:val="Heading1"/>
+        <w:pBdr>
+          <w:bottom w:val="single" w:sz="6" w:space="4" w:color="0E7C7B"/>
+        </w:pBdr>
+        <w:spacing w:before="320" w:after="160"/>
+        <w:jc w:val="both"/>
       </w:pPr>
       <w:r>
         <w:rPr>
@@ -291,7 +958,8 @@
           <w:sz w:val="28"/>
           <w:szCs w:val="28"/>
         </w:rPr>
-        <w:t>2. Performance Objectives</w:t>
+        <w:lastRenderedPageBreak/>
+        <w:t>3. Modelling Approach (Preview)</w:t>
       </w:r>
     </w:p>
     <w:p>
@@ -305,7 +973,7 @@
           <w:sz w:val="22"/>
           <w:szCs w:val="22"/>
         </w:rPr>
-        <w:t>The performance modelling and evaluation in the final report will focus on the following objectives:</w:t>
+        <w:t>The final report will combine two complementary techniques:</w:t>
       </w:r>
     </w:p>
     <w:p>
@@ -313,10 +981,19 @@
         <w:pStyle w:val="ListParagraph"/>
         <w:numPr>
           <w:ilvl w:val="0"/>
-          <w:numId w:val="2"/>
+          <w:numId w:val="1"/>
         </w:numPr>
         <w:spacing w:after="80"/>
-      </w:pPr>
+        <w:jc w:val="both"/>
+      </w:pPr>
+      <w:r>
+        <w:rPr>
+          <w:color w:val="262626"/>
+          <w:sz w:val="22"/>
+          <w:szCs w:val="22"/>
+        </w:rPr>
+        <w:t xml:space="preserve">Analytical queuing model – each stage will be approximated as an M/M/c queue (Poisson arrivals, exponential service times, c parallel servers), allowing closed-form estimates of </w:t>
+      </w:r>
       <w:proofErr w:type="spellStart"/>
       <w:r>
         <w:rPr>
@@ -324,7 +1001,7 @@
           <w:sz w:val="22"/>
           <w:szCs w:val="22"/>
         </w:rPr>
-        <w:t>Minimise</w:t>
+        <w:t>Wq</w:t>
       </w:r>
       <w:proofErr w:type="spellEnd"/>
       <w:r>
@@ -333,7 +1010,7 @@
           <w:sz w:val="22"/>
           <w:szCs w:val="22"/>
         </w:rPr>
-        <w:t xml:space="preserve"> average invoice turnaround time – the total elapsed time from submission to final Approved/Rejected/Returned status.</w:t>
+        <w:t>, W and ρ to be derived and validated against the simulated data.</w:t>
       </w:r>
     </w:p>
     <w:p>
@@ -341,35 +1018,32 @@
         <w:pStyle w:val="ListParagraph"/>
         <w:numPr>
           <w:ilvl w:val="0"/>
-          <w:numId w:val="2"/>
+          <w:numId w:val="1"/>
         </w:numPr>
         <w:spacing w:after="80"/>
-      </w:pPr>
-      <w:r>
-        <w:rPr>
-          <w:color w:val="262626"/>
-          <w:sz w:val="22"/>
-          <w:szCs w:val="22"/>
-        </w:rPr>
-        <w:t>Identify the bottleneck stage – determine whether Initial Review or Manager Approval contributes more to overall delay, and under what load conditions this shifts.</w:t>
-      </w:r>
-    </w:p>
-    <w:p>
-      <w:pPr>
-        <w:pStyle w:val="ListParagraph"/>
-        <w:numPr>
-          <w:ilvl w:val="0"/>
-          <w:numId w:val="2"/>
-        </w:numPr>
-        <w:spacing w:after="80"/>
-      </w:pPr>
-      <w:r>
-        <w:rPr>
-          <w:color w:val="262626"/>
-          <w:sz w:val="22"/>
-          <w:szCs w:val="22"/>
-        </w:rPr>
-        <w:t xml:space="preserve">Measure resource (approver) </w:t>
+        <w:jc w:val="both"/>
+      </w:pPr>
+      <w:r>
+        <w:rPr>
+          <w:color w:val="262626"/>
+          <w:sz w:val="22"/>
+          <w:szCs w:val="22"/>
+        </w:rPr>
+        <w:t>Discrete-event simulation – a Python-based simulation (used to generate the dataset below) that models each invoice individually as it moves through arrival, queueing, and service at both stages, capturing effects that the analytical model simplifies away (e.g. returns/rejections, priority handling, and the month-end non-stationary arrival rate).</w:t>
+      </w:r>
+    </w:p>
+    <w:p>
+      <w:pPr>
+        <w:spacing w:after="160" w:line="288" w:lineRule="auto"/>
+        <w:jc w:val="both"/>
+      </w:pPr>
+      <w:r>
+        <w:rPr>
+          <w:color w:val="262626"/>
+          <w:sz w:val="22"/>
+          <w:szCs w:val="22"/>
+        </w:rPr>
+        <w:t xml:space="preserve">Comparing the analytical and simulated results will help validate the model's assumptions and reveal where real system </w:t>
       </w:r>
       <w:proofErr w:type="spellStart"/>
       <w:r>
@@ -378,7 +1052,7 @@
           <w:sz w:val="22"/>
           <w:szCs w:val="22"/>
         </w:rPr>
-        <w:t>utilisation</w:t>
+        <w:t>behaviour</w:t>
       </w:r>
       <w:proofErr w:type="spellEnd"/>
       <w:r>
@@ -387,18 +1061,8 @@
           <w:sz w:val="22"/>
           <w:szCs w:val="22"/>
         </w:rPr>
-        <w:t xml:space="preserve"> – quantify how busy reviewers and managers are individually and as a pool, to detect over- or under-staffing.</w:t>
-      </w:r>
-    </w:p>
-    <w:p>
-      <w:pPr>
-        <w:pStyle w:val="ListParagraph"/>
-        <w:numPr>
-          <w:ilvl w:val="0"/>
-          <w:numId w:val="2"/>
-        </w:numPr>
-        <w:spacing w:after="80"/>
-      </w:pPr>
+        <w:t xml:space="preserve"> departs from the </w:t>
+      </w:r>
       <w:proofErr w:type="spellStart"/>
       <w:r>
         <w:rPr>
@@ -406,7 +1070,7 @@
           <w:sz w:val="22"/>
           <w:szCs w:val="22"/>
         </w:rPr>
-        <w:t>Analyse</w:t>
+        <w:t>idealised</w:t>
       </w:r>
       <w:proofErr w:type="spellEnd"/>
       <w:r>
@@ -415,93 +1079,7 @@
           <w:sz w:val="22"/>
           <w:szCs w:val="22"/>
         </w:rPr>
-        <w:t xml:space="preserve"> throughput under peak load – specifically the month-end surge period, when invoice arrival rates rise sharply compared to normal business days.</w:t>
-      </w:r>
-    </w:p>
-    <w:p>
-      <w:pPr>
-        <w:pStyle w:val="ListParagraph"/>
-        <w:numPr>
-          <w:ilvl w:val="0"/>
-          <w:numId w:val="2"/>
-        </w:numPr>
-        <w:spacing w:after="80"/>
-      </w:pPr>
-      <w:r>
-        <w:rPr>
-          <w:color w:val="262626"/>
-          <w:sz w:val="22"/>
-          <w:szCs w:val="22"/>
-        </w:rPr>
-        <w:t>Assess scalability – estimate how the system would behave if invoice volume doubled, or if an additional reviewer/manager were added, using the queuing model as a what-if tool.</w:t>
-      </w:r>
-    </w:p>
-    <w:p>
-      <w:pPr>
-        <w:spacing w:after="160" w:line="288" w:lineRule="auto"/>
-        <w:jc w:val="both"/>
-      </w:pPr>
-      <w:r>
-        <w:rPr>
-          <w:color w:val="262626"/>
-          <w:sz w:val="22"/>
-          <w:szCs w:val="22"/>
-        </w:rPr>
-        <w:t>These objectives map directly onto standard performance metrics used in queuing analysis: mean waiting time (</w:t>
-      </w:r>
-      <w:proofErr w:type="spellStart"/>
-      <w:r>
-        <w:rPr>
-          <w:color w:val="262626"/>
-          <w:sz w:val="22"/>
-          <w:szCs w:val="22"/>
-        </w:rPr>
-        <w:t>Wq</w:t>
-      </w:r>
-      <w:proofErr w:type="spellEnd"/>
-      <w:r>
-        <w:rPr>
-          <w:color w:val="262626"/>
-          <w:sz w:val="22"/>
-          <w:szCs w:val="22"/>
-        </w:rPr>
-        <w:t xml:space="preserve">), mean time in system (W), server </w:t>
-      </w:r>
-      <w:proofErr w:type="spellStart"/>
-      <w:r>
-        <w:rPr>
-          <w:color w:val="262626"/>
-          <w:sz w:val="22"/>
-          <w:szCs w:val="22"/>
-        </w:rPr>
-        <w:t>utilisation</w:t>
-      </w:r>
-      <w:proofErr w:type="spellEnd"/>
-      <w:r>
-        <w:rPr>
-          <w:color w:val="262626"/>
-          <w:sz w:val="22"/>
-          <w:szCs w:val="22"/>
-        </w:rPr>
-        <w:t xml:space="preserve"> (ρ = λ/(</w:t>
-      </w:r>
-      <w:proofErr w:type="spellStart"/>
-      <w:r>
-        <w:rPr>
-          <w:color w:val="262626"/>
-          <w:sz w:val="22"/>
-          <w:szCs w:val="22"/>
-        </w:rPr>
-        <w:t>c·μ</w:t>
-      </w:r>
-      <w:proofErr w:type="spellEnd"/>
-      <w:r>
-        <w:rPr>
-          <w:color w:val="262626"/>
-          <w:sz w:val="22"/>
-          <w:szCs w:val="22"/>
-        </w:rPr>
-        <w:t>)), and throughput (λ effective), which will be estimated from the dataset described below and compared against an analytical multi-server queuing model (M/M/c) in the final submission.</w:t>
+        <w:t xml:space="preserve"> queuing theory — this comparison will form the core of the “Detailed Analysis and Findings” section of the final report.</w:t>
       </w:r>
     </w:p>
     <w:p>
@@ -511,6 +1089,7 @@
           <w:bottom w:val="single" w:sz="6" w:space="4" w:color="0E7C7B"/>
         </w:pBdr>
         <w:spacing w:before="320" w:after="160"/>
+        <w:jc w:val="both"/>
       </w:pPr>
       <w:r>
         <w:rPr>
@@ -520,7 +1099,7 @@
           <w:sz w:val="28"/>
           <w:szCs w:val="28"/>
         </w:rPr>
-        <w:t>3. Modelling Approach (Preview)</w:t>
+        <w:t>4. Dataset Description and Methodology</w:t>
       </w:r>
     </w:p>
     <w:p>
@@ -534,7 +1113,41 @@
           <w:sz w:val="22"/>
           <w:szCs w:val="22"/>
         </w:rPr>
-        <w:t>The final report will combine two complementary techniques:</w:t>
+        <w:t>Because production ERP audit logs are not accessible outside the company's internal systems, the dataset was generated using a discrete-event simulation written in Python (</w:t>
+      </w:r>
+      <w:proofErr w:type="spellStart"/>
+      <w:proofErr w:type="gramStart"/>
+      <w:r>
+        <w:rPr>
+          <w:color w:val="262626"/>
+          <w:sz w:val="22"/>
+          <w:szCs w:val="22"/>
+        </w:rPr>
+        <w:t>random.expovariate</w:t>
+      </w:r>
+      <w:proofErr w:type="spellEnd"/>
+      <w:proofErr w:type="gramEnd"/>
+      <w:r>
+        <w:rPr>
+          <w:color w:val="262626"/>
+          <w:sz w:val="22"/>
+          <w:szCs w:val="22"/>
+        </w:rPr>
+        <w:t xml:space="preserve"> for inter-arrival and service times), calibrated using realistic parameters drawn from my direct observation of the live system during the automation project (approximate reviewer/manager processing times, number of parallel staff, and the month-end volume spike).</w:t>
+      </w:r>
+    </w:p>
+    <w:p>
+      <w:pPr>
+        <w:spacing w:after="160" w:line="288" w:lineRule="auto"/>
+        <w:jc w:val="both"/>
+      </w:pPr>
+      <w:r>
+        <w:rPr>
+          <w:color w:val="262626"/>
+          <w:sz w:val="22"/>
+          <w:szCs w:val="22"/>
+        </w:rPr>
+        <w:t>Simulation parameters used:</w:t>
       </w:r>
     </w:p>
     <w:p>
@@ -542,36 +1155,18 @@
         <w:pStyle w:val="ListParagraph"/>
         <w:numPr>
           <w:ilvl w:val="0"/>
-          <w:numId w:val="2"/>
+          <w:numId w:val="1"/>
         </w:numPr>
         <w:spacing w:after="80"/>
-      </w:pPr>
-      <w:r>
-        <w:rPr>
-          <w:color w:val="262626"/>
-          <w:sz w:val="22"/>
-          <w:szCs w:val="22"/>
-        </w:rPr>
-        <w:lastRenderedPageBreak/>
-        <w:t xml:space="preserve">Analytical queuing model – each stage will be approximated as an M/M/c queue (Poisson arrivals, exponential service times, c parallel servers), allowing closed-form estimates of </w:t>
-      </w:r>
-      <w:proofErr w:type="spellStart"/>
-      <w:r>
-        <w:rPr>
-          <w:color w:val="262626"/>
-          <w:sz w:val="22"/>
-          <w:szCs w:val="22"/>
-        </w:rPr>
-        <w:t>Wq</w:t>
-      </w:r>
-      <w:proofErr w:type="spellEnd"/>
-      <w:r>
-        <w:rPr>
-          <w:color w:val="262626"/>
-          <w:sz w:val="22"/>
-          <w:szCs w:val="22"/>
-        </w:rPr>
-        <w:t>, W and ρ to be derived and validated against the simulated data.</w:t>
+        <w:jc w:val="both"/>
+      </w:pPr>
+      <w:r>
+        <w:rPr>
+          <w:color w:val="262626"/>
+          <w:sz w:val="22"/>
+          <w:szCs w:val="22"/>
+        </w:rPr>
+        <w:t>Simulation period: 30 calendar days (26 working days, 08:00–17:00), 1 June – 30 June 2026</w:t>
       </w:r>
     </w:p>
     <w:p>
@@ -579,134 +1174,18 @@
         <w:pStyle w:val="ListParagraph"/>
         <w:numPr>
           <w:ilvl w:val="0"/>
-          <w:numId w:val="2"/>
+          <w:numId w:val="1"/>
         </w:numPr>
         <w:spacing w:after="80"/>
-      </w:pPr>
-      <w:r>
-        <w:rPr>
-          <w:color w:val="262626"/>
-          <w:sz w:val="22"/>
-          <w:szCs w:val="22"/>
-        </w:rPr>
-        <w:t>Discrete-event simulation – a Python-based simulation (used to generate the dataset below) that models each invoice individually as it moves through arrival, queueing, and service at both stages, capturing effects that the analytical model simplifies away (e.g. returns/rejections, priority handling, and the month-end non-stationary arrival rate).</w:t>
-      </w:r>
-    </w:p>
-    <w:p>
-      <w:pPr>
-        <w:spacing w:after="160" w:line="288" w:lineRule="auto"/>
-        <w:jc w:val="both"/>
-      </w:pPr>
-      <w:r>
-        <w:rPr>
-          <w:color w:val="262626"/>
-          <w:sz w:val="22"/>
-          <w:szCs w:val="22"/>
-        </w:rPr>
-        <w:t xml:space="preserve">Comparing the analytical and simulated results will help validate the model's assumptions and reveal where real system </w:t>
-      </w:r>
-      <w:proofErr w:type="spellStart"/>
-      <w:r>
-        <w:rPr>
-          <w:color w:val="262626"/>
-          <w:sz w:val="22"/>
-          <w:szCs w:val="22"/>
-        </w:rPr>
-        <w:t>behaviour</w:t>
-      </w:r>
-      <w:proofErr w:type="spellEnd"/>
-      <w:r>
-        <w:rPr>
-          <w:color w:val="262626"/>
-          <w:sz w:val="22"/>
-          <w:szCs w:val="22"/>
-        </w:rPr>
-        <w:t xml:space="preserve"> departs from the </w:t>
-      </w:r>
-      <w:proofErr w:type="spellStart"/>
-      <w:r>
-        <w:rPr>
-          <w:color w:val="262626"/>
-          <w:sz w:val="22"/>
-          <w:szCs w:val="22"/>
-        </w:rPr>
-        <w:t>idealised</w:t>
-      </w:r>
-      <w:proofErr w:type="spellEnd"/>
-      <w:r>
-        <w:rPr>
-          <w:color w:val="262626"/>
-          <w:sz w:val="22"/>
-          <w:szCs w:val="22"/>
-        </w:rPr>
-        <w:t xml:space="preserve"> queuing theory — this comparison will form the core of the “Detailed Analysis and Findings” section of the final report.</w:t>
-      </w:r>
-    </w:p>
-    <w:p>
-      <w:pPr>
-        <w:pStyle w:val="Heading1"/>
-        <w:pBdr>
-          <w:bottom w:val="single" w:sz="6" w:space="4" w:color="0E7C7B"/>
-        </w:pBdr>
-        <w:spacing w:before="320" w:after="160"/>
-      </w:pPr>
-      <w:r>
-        <w:rPr>
-          <w:b/>
-          <w:bCs/>
-          <w:color w:val="1F3864"/>
-          <w:sz w:val="28"/>
-          <w:szCs w:val="28"/>
-        </w:rPr>
-        <w:t>4. Dataset Description and Methodology</w:t>
-      </w:r>
-    </w:p>
-    <w:p>
-      <w:pPr>
-        <w:spacing w:after="160" w:line="288" w:lineRule="auto"/>
-        <w:jc w:val="both"/>
-      </w:pPr>
-      <w:r>
-        <w:rPr>
-          <w:color w:val="262626"/>
-          <w:sz w:val="22"/>
-          <w:szCs w:val="22"/>
-        </w:rPr>
-        <w:t>Because production ERP audit logs are not accessible outside the company's internal systems, the dataset was generated using a discrete-event simulation written in Python (</w:t>
-      </w:r>
-      <w:proofErr w:type="spellStart"/>
-      <w:proofErr w:type="gramStart"/>
-      <w:r>
-        <w:rPr>
-          <w:color w:val="262626"/>
-          <w:sz w:val="22"/>
-          <w:szCs w:val="22"/>
-        </w:rPr>
-        <w:t>random.expovariate</w:t>
-      </w:r>
-      <w:proofErr w:type="spellEnd"/>
-      <w:proofErr w:type="gramEnd"/>
-      <w:r>
-        <w:rPr>
-          <w:color w:val="262626"/>
-          <w:sz w:val="22"/>
-          <w:szCs w:val="22"/>
-        </w:rPr>
-        <w:t xml:space="preserve"> for inter-arrival and service times), calibrated using realistic parameters drawn from my direct observation of the live system during the automation project (approximate reviewer/manager processing times, number of parallel staff, and the month-end volume spike).</w:t>
-      </w:r>
-    </w:p>
-    <w:p>
-      <w:pPr>
-        <w:spacing w:after="160" w:line="288" w:lineRule="auto"/>
-        <w:jc w:val="both"/>
-      </w:pPr>
-      <w:r>
-        <w:rPr>
-          <w:color w:val="262626"/>
-          <w:sz w:val="22"/>
-          <w:szCs w:val="22"/>
-        </w:rPr>
-        <w:t>Simulation parameters used:</w:t>
+        <w:jc w:val="both"/>
+      </w:pPr>
+      <w:r>
+        <w:rPr>
+          <w:color w:val="262626"/>
+          <w:sz w:val="22"/>
+          <w:szCs w:val="22"/>
+        </w:rPr>
+        <w:t>Arrival rate: ~5 invoices/hour on normal days, ~14 invoices/hour during the month-end period (days 26–30)</w:t>
       </w:r>
     </w:p>
     <w:p>
@@ -714,17 +1193,18 @@
         <w:pStyle w:val="ListParagraph"/>
         <w:numPr>
           <w:ilvl w:val="0"/>
-          <w:numId w:val="2"/>
+          <w:numId w:val="1"/>
         </w:numPr>
         <w:spacing w:after="80"/>
-      </w:pPr>
-      <w:r>
-        <w:rPr>
-          <w:color w:val="262626"/>
-          <w:sz w:val="22"/>
-          <w:szCs w:val="22"/>
-        </w:rPr>
-        <w:t>Simulation period: 30 calendar days (26 working days, 08:00–17:00), 1 June – 30 June 2026</w:t>
+        <w:jc w:val="both"/>
+      </w:pPr>
+      <w:r>
+        <w:rPr>
+          <w:color w:val="262626"/>
+          <w:sz w:val="22"/>
+          <w:szCs w:val="22"/>
+        </w:rPr>
+        <w:t>Stage 1 servers: 3 reviewers, mean service time 6.0 minutes</w:t>
       </w:r>
     </w:p>
     <w:p>
@@ -732,17 +1212,18 @@
         <w:pStyle w:val="ListParagraph"/>
         <w:numPr>
           <w:ilvl w:val="0"/>
-          <w:numId w:val="2"/>
+          <w:numId w:val="1"/>
         </w:numPr>
         <w:spacing w:after="80"/>
-      </w:pPr>
-      <w:r>
-        <w:rPr>
-          <w:color w:val="262626"/>
-          <w:sz w:val="22"/>
-          <w:szCs w:val="22"/>
-        </w:rPr>
-        <w:t>Arrival rate: ~5 invoices/hour on normal days, ~14 invoices/hour during the month-end period (days 26–30)</w:t>
+        <w:jc w:val="both"/>
+      </w:pPr>
+      <w:r>
+        <w:rPr>
+          <w:color w:val="262626"/>
+          <w:sz w:val="22"/>
+          <w:szCs w:val="22"/>
+        </w:rPr>
+        <w:t>Stage 2 servers: 2 managers, mean service time 9.5 minutes</w:t>
       </w:r>
     </w:p>
     <w:p>
@@ -750,17 +1231,18 @@
         <w:pStyle w:val="ListParagraph"/>
         <w:numPr>
           <w:ilvl w:val="0"/>
-          <w:numId w:val="2"/>
+          <w:numId w:val="1"/>
         </w:numPr>
         <w:spacing w:after="80"/>
-      </w:pPr>
-      <w:r>
-        <w:rPr>
-          <w:color w:val="262626"/>
-          <w:sz w:val="22"/>
-          <w:szCs w:val="22"/>
-        </w:rPr>
-        <w:t>Stage 1 servers: 3 reviewers, mean service time 6.0 minutes</w:t>
+        <w:jc w:val="both"/>
+      </w:pPr>
+      <w:r>
+        <w:rPr>
+          <w:color w:val="262626"/>
+          <w:sz w:val="22"/>
+          <w:szCs w:val="22"/>
+        </w:rPr>
+        <w:t>Stage 1 return rate: 12% of invoices sent back to the distributor</w:t>
       </w:r>
     </w:p>
     <w:p>
@@ -768,45 +1250,10 @@
         <w:pStyle w:val="ListParagraph"/>
         <w:numPr>
           <w:ilvl w:val="0"/>
-          <w:numId w:val="2"/>
+          <w:numId w:val="1"/>
         </w:numPr>
         <w:spacing w:after="80"/>
-      </w:pPr>
-      <w:r>
-        <w:rPr>
-          <w:color w:val="262626"/>
-          <w:sz w:val="22"/>
-          <w:szCs w:val="22"/>
-        </w:rPr>
-        <w:t>Stage 2 servers: 2 managers, mean service time 9.5 minutes</w:t>
-      </w:r>
-    </w:p>
-    <w:p>
-      <w:pPr>
-        <w:pStyle w:val="ListParagraph"/>
-        <w:numPr>
-          <w:ilvl w:val="0"/>
-          <w:numId w:val="2"/>
-        </w:numPr>
-        <w:spacing w:after="80"/>
-      </w:pPr>
-      <w:r>
-        <w:rPr>
-          <w:color w:val="262626"/>
-          <w:sz w:val="22"/>
-          <w:szCs w:val="22"/>
-        </w:rPr>
-        <w:t>Stage 1 return rate: 12% of invoices sent back to the distributor</w:t>
-      </w:r>
-    </w:p>
-    <w:p>
-      <w:pPr>
-        <w:pStyle w:val="ListParagraph"/>
-        <w:numPr>
-          <w:ilvl w:val="0"/>
-          <w:numId w:val="2"/>
-        </w:numPr>
-        <w:spacing w:after="80"/>
+        <w:jc w:val="both"/>
       </w:pPr>
       <w:r>
         <w:rPr>
@@ -853,6 +1300,7 @@
       <w:pPr>
         <w:pStyle w:val="Heading2"/>
         <w:spacing w:before="240" w:after="120"/>
+        <w:jc w:val="both"/>
       </w:pPr>
       <w:r>
         <w:rPr>
@@ -888,12 +1336,6 @@
         <w:gridCol w:w="2800"/>
       </w:tblGrid>
       <w:tr>
-        <w:tblPrEx>
-          <w:tblCellMar>
-            <w:top w:w="0" w:type="dxa"/>
-            <w:bottom w:w="0" w:type="dxa"/>
-          </w:tblCellMar>
-        </w:tblPrEx>
         <w:trPr>
           <w:tblHeader/>
         </w:trPr>
@@ -909,6 +1351,9 @@
             </w:tcMar>
           </w:tcPr>
           <w:p>
+            <w:pPr>
+              <w:jc w:val="both"/>
+            </w:pPr>
             <w:r>
               <w:rPr>
                 <w:b/>
@@ -933,6 +1378,9 @@
             </w:tcMar>
           </w:tcPr>
           <w:p>
+            <w:pPr>
+              <w:jc w:val="both"/>
+            </w:pPr>
             <w:r>
               <w:rPr>
                 <w:b/>
@@ -957,6 +1405,9 @@
             </w:tcMar>
           </w:tcPr>
           <w:p>
+            <w:pPr>
+              <w:jc w:val="both"/>
+            </w:pPr>
             <w:r>
               <w:rPr>
                 <w:b/>
@@ -971,12 +1422,6 @@
         </w:tc>
       </w:tr>
       <w:tr>
-        <w:tblPrEx>
-          <w:tblCellMar>
-            <w:top w:w="0" w:type="dxa"/>
-            <w:bottom w:w="0" w:type="dxa"/>
-          </w:tblCellMar>
-        </w:tblPrEx>
         <w:tc>
           <w:tcPr>
             <w:tcW w:w="2400" w:type="dxa"/>
@@ -988,6 +1433,9 @@
             </w:tcMar>
           </w:tcPr>
           <w:p>
+            <w:pPr>
+              <w:jc w:val="both"/>
+            </w:pPr>
             <w:proofErr w:type="spellStart"/>
             <w:r>
               <w:rPr>
@@ -1011,6 +1459,9 @@
             </w:tcMar>
           </w:tcPr>
           <w:p>
+            <w:pPr>
+              <w:jc w:val="both"/>
+            </w:pPr>
             <w:r>
               <w:rPr>
                 <w:color w:val="262626"/>
@@ -1032,6 +1483,9 @@
             </w:tcMar>
           </w:tcPr>
           <w:p>
+            <w:pPr>
+              <w:jc w:val="both"/>
+            </w:pPr>
             <w:r>
               <w:rPr>
                 <w:color w:val="262626"/>
@@ -1044,12 +1498,6 @@
         </w:tc>
       </w:tr>
       <w:tr>
-        <w:tblPrEx>
-          <w:tblCellMar>
-            <w:top w:w="0" w:type="dxa"/>
-            <w:bottom w:w="0" w:type="dxa"/>
-          </w:tblCellMar>
-        </w:tblPrEx>
         <w:tc>
           <w:tcPr>
             <w:tcW w:w="2400" w:type="dxa"/>
@@ -1061,6 +1509,9 @@
             </w:tcMar>
           </w:tcPr>
           <w:p>
+            <w:pPr>
+              <w:jc w:val="both"/>
+            </w:pPr>
             <w:proofErr w:type="spellStart"/>
             <w:r>
               <w:rPr>
@@ -1084,6 +1535,9 @@
             </w:tcMar>
           </w:tcPr>
           <w:p>
+            <w:pPr>
+              <w:jc w:val="both"/>
+            </w:pPr>
             <w:r>
               <w:rPr>
                 <w:color w:val="262626"/>
@@ -1105,6 +1559,9 @@
             </w:tcMar>
           </w:tcPr>
           <w:p>
+            <w:pPr>
+              <w:jc w:val="both"/>
+            </w:pPr>
             <w:r>
               <w:rPr>
                 <w:color w:val="262626"/>
@@ -1117,12 +1574,6 @@
         </w:tc>
       </w:tr>
       <w:tr>
-        <w:tblPrEx>
-          <w:tblCellMar>
-            <w:top w:w="0" w:type="dxa"/>
-            <w:bottom w:w="0" w:type="dxa"/>
-          </w:tblCellMar>
-        </w:tblPrEx>
         <w:tc>
           <w:tcPr>
             <w:tcW w:w="2400" w:type="dxa"/>
@@ -1134,6 +1585,9 @@
             </w:tcMar>
           </w:tcPr>
           <w:p>
+            <w:pPr>
+              <w:jc w:val="both"/>
+            </w:pPr>
             <w:r>
               <w:rPr>
                 <w:color w:val="262626"/>
@@ -1155,6 +1609,9 @@
             </w:tcMar>
           </w:tcPr>
           <w:p>
+            <w:pPr>
+              <w:jc w:val="both"/>
+            </w:pPr>
             <w:r>
               <w:rPr>
                 <w:color w:val="262626"/>
@@ -1194,6 +1651,9 @@
             </w:tcMar>
           </w:tcPr>
           <w:p>
+            <w:pPr>
+              <w:jc w:val="both"/>
+            </w:pPr>
             <w:r>
               <w:rPr>
                 <w:color w:val="262626"/>
@@ -1206,12 +1666,6 @@
         </w:tc>
       </w:tr>
       <w:tr>
-        <w:tblPrEx>
-          <w:tblCellMar>
-            <w:top w:w="0" w:type="dxa"/>
-            <w:bottom w:w="0" w:type="dxa"/>
-          </w:tblCellMar>
-        </w:tblPrEx>
         <w:tc>
           <w:tcPr>
             <w:tcW w:w="2400" w:type="dxa"/>
@@ -1223,6 +1677,9 @@
             </w:tcMar>
           </w:tcPr>
           <w:p>
+            <w:pPr>
+              <w:jc w:val="both"/>
+            </w:pPr>
             <w:proofErr w:type="spellStart"/>
             <w:r>
               <w:rPr>
@@ -1246,6 +1703,9 @@
             </w:tcMar>
           </w:tcPr>
           <w:p>
+            <w:pPr>
+              <w:jc w:val="both"/>
+            </w:pPr>
             <w:r>
               <w:rPr>
                 <w:color w:val="262626"/>
@@ -1267,6 +1727,9 @@
             </w:tcMar>
           </w:tcPr>
           <w:p>
+            <w:pPr>
+              <w:jc w:val="both"/>
+            </w:pPr>
             <w:r>
               <w:rPr>
                 <w:color w:val="262626"/>
@@ -1279,12 +1742,6 @@
         </w:tc>
       </w:tr>
       <w:tr>
-        <w:tblPrEx>
-          <w:tblCellMar>
-            <w:top w:w="0" w:type="dxa"/>
-            <w:bottom w:w="0" w:type="dxa"/>
-          </w:tblCellMar>
-        </w:tblPrEx>
         <w:tc>
           <w:tcPr>
             <w:tcW w:w="2400" w:type="dxa"/>
@@ -1296,6 +1753,9 @@
             </w:tcMar>
           </w:tcPr>
           <w:p>
+            <w:pPr>
+              <w:jc w:val="both"/>
+            </w:pPr>
             <w:proofErr w:type="spellStart"/>
             <w:r>
               <w:rPr>
@@ -1319,6 +1779,9 @@
             </w:tcMar>
           </w:tcPr>
           <w:p>
+            <w:pPr>
+              <w:jc w:val="both"/>
+            </w:pPr>
             <w:r>
               <w:rPr>
                 <w:color w:val="262626"/>
@@ -1340,6 +1803,9 @@
             </w:tcMar>
           </w:tcPr>
           <w:p>
+            <w:pPr>
+              <w:jc w:val="both"/>
+            </w:pPr>
             <w:r>
               <w:rPr>
                 <w:color w:val="262626"/>
@@ -1352,12 +1818,6 @@
         </w:tc>
       </w:tr>
       <w:tr>
-        <w:tblPrEx>
-          <w:tblCellMar>
-            <w:top w:w="0" w:type="dxa"/>
-            <w:bottom w:w="0" w:type="dxa"/>
-          </w:tblCellMar>
-        </w:tblPrEx>
         <w:tc>
           <w:tcPr>
             <w:tcW w:w="2400" w:type="dxa"/>
@@ -1369,6 +1829,9 @@
             </w:tcMar>
           </w:tcPr>
           <w:p>
+            <w:pPr>
+              <w:jc w:val="both"/>
+            </w:pPr>
             <w:r>
               <w:rPr>
                 <w:color w:val="262626"/>
@@ -1390,6 +1853,9 @@
             </w:tcMar>
           </w:tcPr>
           <w:p>
+            <w:pPr>
+              <w:jc w:val="both"/>
+            </w:pPr>
             <w:r>
               <w:rPr>
                 <w:color w:val="262626"/>
@@ -1411,6 +1877,9 @@
             </w:tcMar>
           </w:tcPr>
           <w:p>
+            <w:pPr>
+              <w:jc w:val="both"/>
+            </w:pPr>
             <w:r>
               <w:rPr>
                 <w:color w:val="262626"/>
@@ -1423,12 +1892,6 @@
         </w:tc>
       </w:tr>
       <w:tr>
-        <w:tblPrEx>
-          <w:tblCellMar>
-            <w:top w:w="0" w:type="dxa"/>
-            <w:bottom w:w="0" w:type="dxa"/>
-          </w:tblCellMar>
-        </w:tblPrEx>
         <w:tc>
           <w:tcPr>
             <w:tcW w:w="2400" w:type="dxa"/>
@@ -1440,6 +1903,9 @@
             </w:tcMar>
           </w:tcPr>
           <w:p>
+            <w:pPr>
+              <w:jc w:val="both"/>
+            </w:pPr>
             <w:r>
               <w:rPr>
                 <w:color w:val="262626"/>
@@ -1461,6 +1927,9 @@
             </w:tcMar>
           </w:tcPr>
           <w:p>
+            <w:pPr>
+              <w:jc w:val="both"/>
+            </w:pPr>
             <w:r>
               <w:rPr>
                 <w:color w:val="262626"/>
@@ -1482,6 +1951,9 @@
             </w:tcMar>
           </w:tcPr>
           <w:p>
+            <w:pPr>
+              <w:jc w:val="both"/>
+            </w:pPr>
             <w:r>
               <w:rPr>
                 <w:color w:val="262626"/>
@@ -1494,12 +1966,6 @@
         </w:tc>
       </w:tr>
       <w:tr>
-        <w:tblPrEx>
-          <w:tblCellMar>
-            <w:top w:w="0" w:type="dxa"/>
-            <w:bottom w:w="0" w:type="dxa"/>
-          </w:tblCellMar>
-        </w:tblPrEx>
         <w:tc>
           <w:tcPr>
             <w:tcW w:w="2400" w:type="dxa"/>
@@ -1511,12 +1977,16 @@
             </w:tcMar>
           </w:tcPr>
           <w:p>
-            <w:r>
-              <w:rPr>
-                <w:color w:val="262626"/>
-                <w:sz w:val="18"/>
-                <w:szCs w:val="18"/>
-              </w:rPr>
+            <w:pPr>
+              <w:jc w:val="both"/>
+            </w:pPr>
+            <w:r>
+              <w:rPr>
+                <w:color w:val="262626"/>
+                <w:sz w:val="18"/>
+                <w:szCs w:val="18"/>
+              </w:rPr>
+              <w:lastRenderedPageBreak/>
               <w:t>Stage1_Service_min</w:t>
             </w:r>
           </w:p>
@@ -1532,6 +2002,9 @@
             </w:tcMar>
           </w:tcPr>
           <w:p>
+            <w:pPr>
+              <w:jc w:val="both"/>
+            </w:pPr>
             <w:r>
               <w:rPr>
                 <w:color w:val="262626"/>
@@ -1553,6 +2026,9 @@
             </w:tcMar>
           </w:tcPr>
           <w:p>
+            <w:pPr>
+              <w:jc w:val="both"/>
+            </w:pPr>
             <w:r>
               <w:rPr>
                 <w:color w:val="262626"/>
@@ -1565,12 +2041,6 @@
         </w:tc>
       </w:tr>
       <w:tr>
-        <w:tblPrEx>
-          <w:tblCellMar>
-            <w:top w:w="0" w:type="dxa"/>
-            <w:bottom w:w="0" w:type="dxa"/>
-          </w:tblCellMar>
-        </w:tblPrEx>
         <w:tc>
           <w:tcPr>
             <w:tcW w:w="2400" w:type="dxa"/>
@@ -1582,6 +2052,9 @@
             </w:tcMar>
           </w:tcPr>
           <w:p>
+            <w:pPr>
+              <w:jc w:val="both"/>
+            </w:pPr>
             <w:r>
               <w:rPr>
                 <w:color w:val="262626"/>
@@ -1603,6 +2076,9 @@
             </w:tcMar>
           </w:tcPr>
           <w:p>
+            <w:pPr>
+              <w:jc w:val="both"/>
+            </w:pPr>
             <w:r>
               <w:rPr>
                 <w:color w:val="262626"/>
@@ -1634,6 +2110,9 @@
             </w:tcMar>
           </w:tcPr>
           <w:p>
+            <w:pPr>
+              <w:jc w:val="both"/>
+            </w:pPr>
             <w:r>
               <w:rPr>
                 <w:color w:val="262626"/>
@@ -1646,12 +2125,6 @@
         </w:tc>
       </w:tr>
       <w:tr>
-        <w:tblPrEx>
-          <w:tblCellMar>
-            <w:top w:w="0" w:type="dxa"/>
-            <w:bottom w:w="0" w:type="dxa"/>
-          </w:tblCellMar>
-        </w:tblPrEx>
         <w:tc>
           <w:tcPr>
             <w:tcW w:w="2400" w:type="dxa"/>
@@ -1663,6 +2136,9 @@
             </w:tcMar>
           </w:tcPr>
           <w:p>
+            <w:pPr>
+              <w:jc w:val="both"/>
+            </w:pPr>
             <w:r>
               <w:rPr>
                 <w:color w:val="262626"/>
@@ -1684,6 +2160,9 @@
             </w:tcMar>
           </w:tcPr>
           <w:p>
+            <w:pPr>
+              <w:jc w:val="both"/>
+            </w:pPr>
             <w:r>
               <w:rPr>
                 <w:color w:val="262626"/>
@@ -1705,6 +2184,9 @@
             </w:tcMar>
           </w:tcPr>
           <w:p>
+            <w:pPr>
+              <w:jc w:val="both"/>
+            </w:pPr>
             <w:r>
               <w:rPr>
                 <w:color w:val="262626"/>
@@ -1717,12 +2199,6 @@
         </w:tc>
       </w:tr>
       <w:tr>
-        <w:tblPrEx>
-          <w:tblCellMar>
-            <w:top w:w="0" w:type="dxa"/>
-            <w:bottom w:w="0" w:type="dxa"/>
-          </w:tblCellMar>
-        </w:tblPrEx>
         <w:tc>
           <w:tcPr>
             <w:tcW w:w="2400" w:type="dxa"/>
@@ -1734,13 +2210,15 @@
             </w:tcMar>
           </w:tcPr>
           <w:p>
-            <w:r>
-              <w:rPr>
-                <w:color w:val="262626"/>
-                <w:sz w:val="18"/>
-                <w:szCs w:val="18"/>
-              </w:rPr>
-              <w:lastRenderedPageBreak/>
+            <w:pPr>
+              <w:jc w:val="both"/>
+            </w:pPr>
+            <w:r>
+              <w:rPr>
+                <w:color w:val="262626"/>
+                <w:sz w:val="18"/>
+                <w:szCs w:val="18"/>
+              </w:rPr>
               <w:t>Stage2_Wait_min</w:t>
             </w:r>
           </w:p>
@@ -1756,6 +2234,9 @@
             </w:tcMar>
           </w:tcPr>
           <w:p>
+            <w:pPr>
+              <w:jc w:val="both"/>
+            </w:pPr>
             <w:r>
               <w:rPr>
                 <w:color w:val="262626"/>
@@ -1777,6 +2258,9 @@
             </w:tcMar>
           </w:tcPr>
           <w:p>
+            <w:pPr>
+              <w:jc w:val="both"/>
+            </w:pPr>
             <w:r>
               <w:rPr>
                 <w:color w:val="262626"/>
@@ -1789,12 +2273,6 @@
         </w:tc>
       </w:tr>
       <w:tr>
-        <w:tblPrEx>
-          <w:tblCellMar>
-            <w:top w:w="0" w:type="dxa"/>
-            <w:bottom w:w="0" w:type="dxa"/>
-          </w:tblCellMar>
-        </w:tblPrEx>
         <w:tc>
           <w:tcPr>
             <w:tcW w:w="2400" w:type="dxa"/>
@@ -1806,6 +2284,9 @@
             </w:tcMar>
           </w:tcPr>
           <w:p>
+            <w:pPr>
+              <w:jc w:val="both"/>
+            </w:pPr>
             <w:r>
               <w:rPr>
                 <w:color w:val="262626"/>
@@ -1827,6 +2308,9 @@
             </w:tcMar>
           </w:tcPr>
           <w:p>
+            <w:pPr>
+              <w:jc w:val="both"/>
+            </w:pPr>
             <w:r>
               <w:rPr>
                 <w:color w:val="262626"/>
@@ -1848,6 +2332,9 @@
             </w:tcMar>
           </w:tcPr>
           <w:p>
+            <w:pPr>
+              <w:jc w:val="both"/>
+            </w:pPr>
             <w:r>
               <w:rPr>
                 <w:color w:val="262626"/>
@@ -1860,12 +2347,6 @@
         </w:tc>
       </w:tr>
       <w:tr>
-        <w:tblPrEx>
-          <w:tblCellMar>
-            <w:top w:w="0" w:type="dxa"/>
-            <w:bottom w:w="0" w:type="dxa"/>
-          </w:tblCellMar>
-        </w:tblPrEx>
         <w:tc>
           <w:tcPr>
             <w:tcW w:w="2400" w:type="dxa"/>
@@ -1877,6 +2358,9 @@
             </w:tcMar>
           </w:tcPr>
           <w:p>
+            <w:pPr>
+              <w:jc w:val="both"/>
+            </w:pPr>
             <w:proofErr w:type="spellStart"/>
             <w:r>
               <w:rPr>
@@ -1900,6 +2384,9 @@
             </w:tcMar>
           </w:tcPr>
           <w:p>
+            <w:pPr>
+              <w:jc w:val="both"/>
+            </w:pPr>
             <w:r>
               <w:rPr>
                 <w:color w:val="262626"/>
@@ -1921,6 +2408,9 @@
             </w:tcMar>
           </w:tcPr>
           <w:p>
+            <w:pPr>
+              <w:jc w:val="both"/>
+            </w:pPr>
             <w:r>
               <w:rPr>
                 <w:color w:val="262626"/>
@@ -1933,12 +2423,6 @@
         </w:tc>
       </w:tr>
       <w:tr>
-        <w:tblPrEx>
-          <w:tblCellMar>
-            <w:top w:w="0" w:type="dxa"/>
-            <w:bottom w:w="0" w:type="dxa"/>
-          </w:tblCellMar>
-        </w:tblPrEx>
         <w:tc>
           <w:tcPr>
             <w:tcW w:w="2400" w:type="dxa"/>
@@ -1950,6 +2434,9 @@
             </w:tcMar>
           </w:tcPr>
           <w:p>
+            <w:pPr>
+              <w:jc w:val="both"/>
+            </w:pPr>
             <w:proofErr w:type="spellStart"/>
             <w:r>
               <w:rPr>
@@ -1973,6 +2460,9 @@
             </w:tcMar>
           </w:tcPr>
           <w:p>
+            <w:pPr>
+              <w:jc w:val="both"/>
+            </w:pPr>
             <w:r>
               <w:rPr>
                 <w:color w:val="262626"/>
@@ -1994,6 +2484,9 @@
             </w:tcMar>
           </w:tcPr>
           <w:p>
+            <w:pPr>
+              <w:jc w:val="both"/>
+            </w:pPr>
             <w:r>
               <w:rPr>
                 <w:color w:val="262626"/>
@@ -2006,12 +2499,6 @@
         </w:tc>
       </w:tr>
       <w:tr>
-        <w:tblPrEx>
-          <w:tblCellMar>
-            <w:top w:w="0" w:type="dxa"/>
-            <w:bottom w:w="0" w:type="dxa"/>
-          </w:tblCellMar>
-        </w:tblPrEx>
         <w:tc>
           <w:tcPr>
             <w:tcW w:w="2400" w:type="dxa"/>
@@ -2023,6 +2510,9 @@
             </w:tcMar>
           </w:tcPr>
           <w:p>
+            <w:pPr>
+              <w:jc w:val="both"/>
+            </w:pPr>
             <w:proofErr w:type="spellStart"/>
             <w:r>
               <w:rPr>
@@ -2046,6 +2536,9 @@
             </w:tcMar>
           </w:tcPr>
           <w:p>
+            <w:pPr>
+              <w:jc w:val="both"/>
+            </w:pPr>
             <w:r>
               <w:rPr>
                 <w:color w:val="262626"/>
@@ -2067,6 +2560,9 @@
             </w:tcMar>
           </w:tcPr>
           <w:p>
+            <w:pPr>
+              <w:jc w:val="both"/>
+            </w:pPr>
             <w:r>
               <w:rPr>
                 <w:color w:val="262626"/>
@@ -2082,12 +2578,14 @@
     <w:p>
       <w:pPr>
         <w:spacing w:before="240"/>
+        <w:jc w:val="both"/>
       </w:pPr>
     </w:p>
     <w:p>
       <w:pPr>
         <w:pStyle w:val="Heading2"/>
         <w:spacing w:before="240" w:after="120"/>
+        <w:jc w:val="both"/>
       </w:pPr>
       <w:r>
         <w:rPr>
@@ -2142,12 +2640,6 @@
         <w:gridCol w:w="1000"/>
       </w:tblGrid>
       <w:tr>
-        <w:tblPrEx>
-          <w:tblCellMar>
-            <w:top w:w="0" w:type="dxa"/>
-            <w:bottom w:w="0" w:type="dxa"/>
-          </w:tblCellMar>
-        </w:tblPrEx>
         <w:trPr>
           <w:tblHeader/>
         </w:trPr>
@@ -2163,6 +2655,9 @@
             </w:tcMar>
           </w:tcPr>
           <w:p>
+            <w:pPr>
+              <w:jc w:val="both"/>
+            </w:pPr>
             <w:r>
               <w:rPr>
                 <w:b/>
@@ -2187,6 +2682,9 @@
             </w:tcMar>
           </w:tcPr>
           <w:p>
+            <w:pPr>
+              <w:jc w:val="both"/>
+            </w:pPr>
             <w:r>
               <w:rPr>
                 <w:b/>
@@ -2212,7 +2710,7 @@
           </w:tcPr>
           <w:p>
             <w:pPr>
-              <w:jc w:val="center"/>
+              <w:jc w:val="both"/>
             </w:pPr>
             <w:r>
               <w:rPr>
@@ -2239,7 +2737,7 @@
           </w:tcPr>
           <w:p>
             <w:pPr>
-              <w:jc w:val="center"/>
+              <w:jc w:val="both"/>
             </w:pPr>
             <w:r>
               <w:rPr>
@@ -2266,7 +2764,7 @@
           </w:tcPr>
           <w:p>
             <w:pPr>
-              <w:jc w:val="center"/>
+              <w:jc w:val="both"/>
             </w:pPr>
             <w:r>
               <w:rPr>
@@ -2293,7 +2791,7 @@
           </w:tcPr>
           <w:p>
             <w:pPr>
-              <w:jc w:val="center"/>
+              <w:jc w:val="both"/>
             </w:pPr>
             <w:r>
               <w:rPr>
@@ -2320,7 +2818,7 @@
           </w:tcPr>
           <w:p>
             <w:pPr>
-              <w:jc w:val="center"/>
+              <w:jc w:val="both"/>
             </w:pPr>
             <w:r>
               <w:rPr>
@@ -2347,7 +2845,7 @@
           </w:tcPr>
           <w:p>
             <w:pPr>
-              <w:jc w:val="center"/>
+              <w:jc w:val="both"/>
             </w:pPr>
             <w:r>
               <w:rPr>
@@ -2363,12 +2861,6 @@
         </w:tc>
       </w:tr>
       <w:tr>
-        <w:tblPrEx>
-          <w:tblCellMar>
-            <w:top w:w="0" w:type="dxa"/>
-            <w:bottom w:w="0" w:type="dxa"/>
-          </w:tblCellMar>
-        </w:tblPrEx>
         <w:tc>
           <w:tcPr>
             <w:tcW w:w="1100" w:type="dxa"/>
@@ -2380,6 +2872,9 @@
             </w:tcMar>
           </w:tcPr>
           <w:p>
+            <w:pPr>
+              <w:jc w:val="both"/>
+            </w:pPr>
             <w:r>
               <w:rPr>
                 <w:color w:val="262626"/>
@@ -2402,7 +2897,7 @@
           </w:tcPr>
           <w:p>
             <w:pPr>
-              <w:jc w:val="center"/>
+              <w:jc w:val="both"/>
             </w:pPr>
             <w:r>
               <w:rPr>
@@ -2426,7 +2921,7 @@
           </w:tcPr>
           <w:p>
             <w:pPr>
-              <w:jc w:val="center"/>
+              <w:jc w:val="both"/>
             </w:pPr>
             <w:r>
               <w:rPr>
@@ -2450,7 +2945,7 @@
           </w:tcPr>
           <w:p>
             <w:pPr>
-              <w:jc w:val="center"/>
+              <w:jc w:val="both"/>
             </w:pPr>
             <w:r>
               <w:rPr>
@@ -2474,7 +2969,7 @@
           </w:tcPr>
           <w:p>
             <w:pPr>
-              <w:jc w:val="center"/>
+              <w:jc w:val="both"/>
             </w:pPr>
             <w:r>
               <w:rPr>
@@ -2498,7 +2993,7 @@
           </w:tcPr>
           <w:p>
             <w:pPr>
-              <w:jc w:val="center"/>
+              <w:jc w:val="both"/>
             </w:pPr>
             <w:r>
               <w:rPr>
@@ -2522,7 +3017,7 @@
           </w:tcPr>
           <w:p>
             <w:pPr>
-              <w:jc w:val="center"/>
+              <w:jc w:val="both"/>
             </w:pPr>
             <w:r>
               <w:rPr>
@@ -2546,7 +3041,7 @@
           </w:tcPr>
           <w:p>
             <w:pPr>
-              <w:jc w:val="center"/>
+              <w:jc w:val="both"/>
             </w:pPr>
             <w:r>
               <w:rPr>
@@ -2560,12 +3055,6 @@
         </w:tc>
       </w:tr>
       <w:tr>
-        <w:tblPrEx>
-          <w:tblCellMar>
-            <w:top w:w="0" w:type="dxa"/>
-            <w:bottom w:w="0" w:type="dxa"/>
-          </w:tblCellMar>
-        </w:tblPrEx>
         <w:tc>
           <w:tcPr>
             <w:tcW w:w="1100" w:type="dxa"/>
@@ -2577,6 +3066,9 @@
             </w:tcMar>
           </w:tcPr>
           <w:p>
+            <w:pPr>
+              <w:jc w:val="both"/>
+            </w:pPr>
             <w:r>
               <w:rPr>
                 <w:color w:val="262626"/>
@@ -2599,7 +3091,7 @@
           </w:tcPr>
           <w:p>
             <w:pPr>
-              <w:jc w:val="center"/>
+              <w:jc w:val="both"/>
             </w:pPr>
             <w:r>
               <w:rPr>
@@ -2623,7 +3115,7 @@
           </w:tcPr>
           <w:p>
             <w:pPr>
-              <w:jc w:val="center"/>
+              <w:jc w:val="both"/>
             </w:pPr>
             <w:r>
               <w:rPr>
@@ -2647,7 +3139,7 @@
           </w:tcPr>
           <w:p>
             <w:pPr>
-              <w:jc w:val="center"/>
+              <w:jc w:val="both"/>
             </w:pPr>
             <w:r>
               <w:rPr>
@@ -2671,7 +3163,7 @@
           </w:tcPr>
           <w:p>
             <w:pPr>
-              <w:jc w:val="center"/>
+              <w:jc w:val="both"/>
             </w:pPr>
             <w:r>
               <w:rPr>
@@ -2695,7 +3187,7 @@
           </w:tcPr>
           <w:p>
             <w:pPr>
-              <w:jc w:val="center"/>
+              <w:jc w:val="both"/>
             </w:pPr>
             <w:r>
               <w:rPr>
@@ -2719,7 +3211,7 @@
           </w:tcPr>
           <w:p>
             <w:pPr>
-              <w:jc w:val="center"/>
+              <w:jc w:val="both"/>
             </w:pPr>
             <w:r>
               <w:rPr>
@@ -2743,7 +3235,7 @@
           </w:tcPr>
           <w:p>
             <w:pPr>
-              <w:jc w:val="center"/>
+              <w:jc w:val="both"/>
             </w:pPr>
             <w:r>
               <w:rPr>
@@ -2757,12 +3249,6 @@
         </w:tc>
       </w:tr>
       <w:tr>
-        <w:tblPrEx>
-          <w:tblCellMar>
-            <w:top w:w="0" w:type="dxa"/>
-            <w:bottom w:w="0" w:type="dxa"/>
-          </w:tblCellMar>
-        </w:tblPrEx>
         <w:tc>
           <w:tcPr>
             <w:tcW w:w="1100" w:type="dxa"/>
@@ -2774,6 +3260,9 @@
             </w:tcMar>
           </w:tcPr>
           <w:p>
+            <w:pPr>
+              <w:jc w:val="both"/>
+            </w:pPr>
             <w:r>
               <w:rPr>
                 <w:color w:val="262626"/>
@@ -2796,7 +3285,7 @@
           </w:tcPr>
           <w:p>
             <w:pPr>
-              <w:jc w:val="center"/>
+              <w:jc w:val="both"/>
             </w:pPr>
             <w:r>
               <w:rPr>
@@ -2820,7 +3309,7 @@
           </w:tcPr>
           <w:p>
             <w:pPr>
-              <w:jc w:val="center"/>
+              <w:jc w:val="both"/>
             </w:pPr>
             <w:r>
               <w:rPr>
@@ -2844,7 +3333,7 @@
           </w:tcPr>
           <w:p>
             <w:pPr>
-              <w:jc w:val="center"/>
+              <w:jc w:val="both"/>
             </w:pPr>
             <w:r>
               <w:rPr>
@@ -2868,7 +3357,7 @@
           </w:tcPr>
           <w:p>
             <w:pPr>
-              <w:jc w:val="center"/>
+              <w:jc w:val="both"/>
             </w:pPr>
             <w:r>
               <w:rPr>
@@ -2892,7 +3381,7 @@
           </w:tcPr>
           <w:p>
             <w:pPr>
-              <w:jc w:val="center"/>
+              <w:jc w:val="both"/>
             </w:pPr>
             <w:r>
               <w:rPr>
@@ -2916,7 +3405,7 @@
           </w:tcPr>
           <w:p>
             <w:pPr>
-              <w:jc w:val="center"/>
+              <w:jc w:val="both"/>
             </w:pPr>
             <w:r>
               <w:rPr>
@@ -2940,7 +3429,7 @@
           </w:tcPr>
           <w:p>
             <w:pPr>
-              <w:jc w:val="center"/>
+              <w:jc w:val="both"/>
             </w:pPr>
             <w:r>
               <w:rPr>
@@ -2954,12 +3443,6 @@
         </w:tc>
       </w:tr>
       <w:tr>
-        <w:tblPrEx>
-          <w:tblCellMar>
-            <w:top w:w="0" w:type="dxa"/>
-            <w:bottom w:w="0" w:type="dxa"/>
-          </w:tblCellMar>
-        </w:tblPrEx>
         <w:tc>
           <w:tcPr>
             <w:tcW w:w="1100" w:type="dxa"/>
@@ -2971,6 +3454,9 @@
             </w:tcMar>
           </w:tcPr>
           <w:p>
+            <w:pPr>
+              <w:jc w:val="both"/>
+            </w:pPr>
             <w:r>
               <w:rPr>
                 <w:color w:val="262626"/>
@@ -2993,7 +3479,7 @@
           </w:tcPr>
           <w:p>
             <w:pPr>
-              <w:jc w:val="center"/>
+              <w:jc w:val="both"/>
             </w:pPr>
             <w:r>
               <w:rPr>
@@ -3017,7 +3503,7 @@
           </w:tcPr>
           <w:p>
             <w:pPr>
-              <w:jc w:val="center"/>
+              <w:jc w:val="both"/>
             </w:pPr>
             <w:r>
               <w:rPr>
@@ -3041,7 +3527,7 @@
           </w:tcPr>
           <w:p>
             <w:pPr>
-              <w:jc w:val="center"/>
+              <w:jc w:val="both"/>
             </w:pPr>
             <w:r>
               <w:rPr>
@@ -3065,7 +3551,7 @@
           </w:tcPr>
           <w:p>
             <w:pPr>
-              <w:jc w:val="center"/>
+              <w:jc w:val="both"/>
             </w:pPr>
             <w:r>
               <w:rPr>
@@ -3089,7 +3575,7 @@
           </w:tcPr>
           <w:p>
             <w:pPr>
-              <w:jc w:val="center"/>
+              <w:jc w:val="both"/>
             </w:pPr>
             <w:r>
               <w:rPr>
@@ -3113,7 +3599,7 @@
           </w:tcPr>
           <w:p>
             <w:pPr>
-              <w:jc w:val="center"/>
+              <w:jc w:val="both"/>
             </w:pPr>
             <w:r>
               <w:rPr>
@@ -3137,7 +3623,7 @@
           </w:tcPr>
           <w:p>
             <w:pPr>
-              <w:jc w:val="center"/>
+              <w:jc w:val="both"/>
             </w:pPr>
             <w:r>
               <w:rPr>
@@ -3151,12 +3637,6 @@
         </w:tc>
       </w:tr>
       <w:tr>
-        <w:tblPrEx>
-          <w:tblCellMar>
-            <w:top w:w="0" w:type="dxa"/>
-            <w:bottom w:w="0" w:type="dxa"/>
-          </w:tblCellMar>
-        </w:tblPrEx>
         <w:tc>
           <w:tcPr>
             <w:tcW w:w="1100" w:type="dxa"/>
@@ -3168,6 +3648,9 @@
             </w:tcMar>
           </w:tcPr>
           <w:p>
+            <w:pPr>
+              <w:jc w:val="both"/>
+            </w:pPr>
             <w:r>
               <w:rPr>
                 <w:color w:val="262626"/>
@@ -3190,7 +3673,7 @@
           </w:tcPr>
           <w:p>
             <w:pPr>
-              <w:jc w:val="center"/>
+              <w:jc w:val="both"/>
             </w:pPr>
             <w:r>
               <w:rPr>
@@ -3214,7 +3697,7 @@
           </w:tcPr>
           <w:p>
             <w:pPr>
-              <w:jc w:val="center"/>
+              <w:jc w:val="both"/>
             </w:pPr>
             <w:r>
               <w:rPr>
@@ -3238,7 +3721,7 @@
           </w:tcPr>
           <w:p>
             <w:pPr>
-              <w:jc w:val="center"/>
+              <w:jc w:val="both"/>
             </w:pPr>
             <w:r>
               <w:rPr>
@@ -3262,7 +3745,7 @@
           </w:tcPr>
           <w:p>
             <w:pPr>
-              <w:jc w:val="center"/>
+              <w:jc w:val="both"/>
             </w:pPr>
             <w:r>
               <w:rPr>
@@ -3286,7 +3769,7 @@
           </w:tcPr>
           <w:p>
             <w:pPr>
-              <w:jc w:val="center"/>
+              <w:jc w:val="both"/>
             </w:pPr>
             <w:r>
               <w:rPr>
@@ -3310,7 +3793,7 @@
           </w:tcPr>
           <w:p>
             <w:pPr>
-              <w:jc w:val="center"/>
+              <w:jc w:val="both"/>
             </w:pPr>
             <w:r>
               <w:rPr>
@@ -3334,7 +3817,7 @@
           </w:tcPr>
           <w:p>
             <w:pPr>
-              <w:jc w:val="center"/>
+              <w:jc w:val="both"/>
             </w:pPr>
             <w:r>
               <w:rPr>
@@ -3348,12 +3831,6 @@
         </w:tc>
       </w:tr>
       <w:tr>
-        <w:tblPrEx>
-          <w:tblCellMar>
-            <w:top w:w="0" w:type="dxa"/>
-            <w:bottom w:w="0" w:type="dxa"/>
-          </w:tblCellMar>
-        </w:tblPrEx>
         <w:tc>
           <w:tcPr>
             <w:tcW w:w="1100" w:type="dxa"/>
@@ -3365,6 +3842,9 @@
             </w:tcMar>
           </w:tcPr>
           <w:p>
+            <w:pPr>
+              <w:jc w:val="both"/>
+            </w:pPr>
             <w:r>
               <w:rPr>
                 <w:color w:val="262626"/>
@@ -3387,7 +3867,7 @@
           </w:tcPr>
           <w:p>
             <w:pPr>
-              <w:jc w:val="center"/>
+              <w:jc w:val="both"/>
             </w:pPr>
             <w:r>
               <w:rPr>
@@ -3411,7 +3891,7 @@
           </w:tcPr>
           <w:p>
             <w:pPr>
-              <w:jc w:val="center"/>
+              <w:jc w:val="both"/>
             </w:pPr>
             <w:r>
               <w:rPr>
@@ -3435,7 +3915,7 @@
           </w:tcPr>
           <w:p>
             <w:pPr>
-              <w:jc w:val="center"/>
+              <w:jc w:val="both"/>
             </w:pPr>
             <w:r>
               <w:rPr>
@@ -3459,7 +3939,7 @@
           </w:tcPr>
           <w:p>
             <w:pPr>
-              <w:jc w:val="center"/>
+              <w:jc w:val="both"/>
             </w:pPr>
             <w:r>
               <w:rPr>
@@ -3483,7 +3963,7 @@
           </w:tcPr>
           <w:p>
             <w:pPr>
-              <w:jc w:val="center"/>
+              <w:jc w:val="both"/>
             </w:pPr>
             <w:r>
               <w:rPr>
@@ -3507,7 +3987,7 @@
           </w:tcPr>
           <w:p>
             <w:pPr>
-              <w:jc w:val="center"/>
+              <w:jc w:val="both"/>
             </w:pPr>
             <w:r>
               <w:rPr>
@@ -3531,7 +4011,7 @@
           </w:tcPr>
           <w:p>
             <w:pPr>
-              <w:jc w:val="center"/>
+              <w:jc w:val="both"/>
             </w:pPr>
             <w:r>
               <w:rPr>
@@ -3545,12 +4025,6 @@
         </w:tc>
       </w:tr>
       <w:tr>
-        <w:tblPrEx>
-          <w:tblCellMar>
-            <w:top w:w="0" w:type="dxa"/>
-            <w:bottom w:w="0" w:type="dxa"/>
-          </w:tblCellMar>
-        </w:tblPrEx>
         <w:tc>
           <w:tcPr>
             <w:tcW w:w="1100" w:type="dxa"/>
@@ -3562,6 +4036,9 @@
             </w:tcMar>
           </w:tcPr>
           <w:p>
+            <w:pPr>
+              <w:jc w:val="both"/>
+            </w:pPr>
             <w:r>
               <w:rPr>
                 <w:color w:val="262626"/>
@@ -3584,7 +4061,7 @@
           </w:tcPr>
           <w:p>
             <w:pPr>
-              <w:jc w:val="center"/>
+              <w:jc w:val="both"/>
             </w:pPr>
             <w:r>
               <w:rPr>
@@ -3608,7 +4085,7 @@
           </w:tcPr>
           <w:p>
             <w:pPr>
-              <w:jc w:val="center"/>
+              <w:jc w:val="both"/>
             </w:pPr>
             <w:r>
               <w:rPr>
@@ -3632,7 +4109,7 @@
           </w:tcPr>
           <w:p>
             <w:pPr>
-              <w:jc w:val="center"/>
+              <w:jc w:val="both"/>
             </w:pPr>
             <w:r>
               <w:rPr>
@@ -3656,7 +4133,7 @@
           </w:tcPr>
           <w:p>
             <w:pPr>
-              <w:jc w:val="center"/>
+              <w:jc w:val="both"/>
             </w:pPr>
             <w:r>
               <w:rPr>
@@ -3680,7 +4157,7 @@
           </w:tcPr>
           <w:p>
             <w:pPr>
-              <w:jc w:val="center"/>
+              <w:jc w:val="both"/>
             </w:pPr>
             <w:r>
               <w:rPr>
@@ -3704,7 +4181,7 @@
           </w:tcPr>
           <w:p>
             <w:pPr>
-              <w:jc w:val="center"/>
+              <w:jc w:val="both"/>
             </w:pPr>
             <w:r>
               <w:rPr>
@@ -3728,7 +4205,7 @@
           </w:tcPr>
           <w:p>
             <w:pPr>
-              <w:jc w:val="center"/>
+              <w:jc w:val="both"/>
             </w:pPr>
             <w:r>
               <w:rPr>
@@ -3742,12 +4219,6 @@
         </w:tc>
       </w:tr>
       <w:tr>
-        <w:tblPrEx>
-          <w:tblCellMar>
-            <w:top w:w="0" w:type="dxa"/>
-            <w:bottom w:w="0" w:type="dxa"/>
-          </w:tblCellMar>
-        </w:tblPrEx>
         <w:tc>
           <w:tcPr>
             <w:tcW w:w="1100" w:type="dxa"/>
@@ -3759,6 +4230,9 @@
             </w:tcMar>
           </w:tcPr>
           <w:p>
+            <w:pPr>
+              <w:jc w:val="both"/>
+            </w:pPr>
             <w:r>
               <w:rPr>
                 <w:color w:val="262626"/>
@@ -3781,7 +4255,7 @@
           </w:tcPr>
           <w:p>
             <w:pPr>
-              <w:jc w:val="center"/>
+              <w:jc w:val="both"/>
             </w:pPr>
             <w:r>
               <w:rPr>
@@ -3805,7 +4279,7 @@
           </w:tcPr>
           <w:p>
             <w:pPr>
-              <w:jc w:val="center"/>
+              <w:jc w:val="both"/>
             </w:pPr>
             <w:r>
               <w:rPr>
@@ -3829,7 +4303,7 @@
           </w:tcPr>
           <w:p>
             <w:pPr>
-              <w:jc w:val="center"/>
+              <w:jc w:val="both"/>
             </w:pPr>
             <w:r>
               <w:rPr>
@@ -3853,7 +4327,7 @@
           </w:tcPr>
           <w:p>
             <w:pPr>
-              <w:jc w:val="center"/>
+              <w:jc w:val="both"/>
             </w:pPr>
             <w:r>
               <w:rPr>
@@ -3877,7 +4351,7 @@
           </w:tcPr>
           <w:p>
             <w:pPr>
-              <w:jc w:val="center"/>
+              <w:jc w:val="both"/>
             </w:pPr>
             <w:r>
               <w:rPr>
@@ -3901,7 +4375,7 @@
           </w:tcPr>
           <w:p>
             <w:pPr>
-              <w:jc w:val="center"/>
+              <w:jc w:val="both"/>
             </w:pPr>
             <w:r>
               <w:rPr>
@@ -3925,7 +4399,7 @@
           </w:tcPr>
           <w:p>
             <w:pPr>
-              <w:jc w:val="center"/>
+              <w:jc w:val="both"/>
             </w:pPr>
             <w:r>
               <w:rPr>
@@ -3942,12 +4416,14 @@
     <w:p>
       <w:pPr>
         <w:spacing w:before="240"/>
+        <w:jc w:val="both"/>
       </w:pPr>
     </w:p>
     <w:p>
       <w:pPr>
         <w:pStyle w:val="Heading2"/>
         <w:spacing w:before="240" w:after="120"/>
+        <w:jc w:val="both"/>
       </w:pPr>
       <w:r>
         <w:rPr>
@@ -3964,6 +4440,11 @@
       <w:pPr>
         <w:spacing w:after="160" w:line="288" w:lineRule="auto"/>
         <w:jc w:val="both"/>
+        <w:rPr>
+          <w:color w:val="262626"/>
+          <w:sz w:val="22"/>
+          <w:szCs w:val="22"/>
+        </w:rPr>
       </w:pPr>
       <w:r>
         <w:rPr>
@@ -3973,6 +4454,67 @@
         </w:rPr>
         <w:t>Even at this preliminary stage, the simulated data shows a clear pattern that motivates the performance objectives in Section 2: average end-to-end turnaround time rises from approximately 15.2 minutes on normal business days to approximately 33.3 minutes during the month-end surge — more than double — while Stage 2 (Manager Approval) contributes the larger share of queueing delay in both periods. This early signal suggests Stage 2 capacity is the primary bottleneck under load, which the full analytical and simulation-based model in the final submission will test and quantify more rigorously.</w:t>
       </w:r>
+    </w:p>
+    <w:p>
+      <w:pPr>
+        <w:spacing w:after="160" w:line="288" w:lineRule="auto"/>
+        <w:jc w:val="both"/>
+        <w:rPr>
+          <w:color w:val="262626"/>
+          <w:sz w:val="22"/>
+          <w:szCs w:val="22"/>
+        </w:rPr>
+      </w:pPr>
+    </w:p>
+    <w:p>
+      <w:pPr>
+        <w:spacing w:after="160" w:line="288" w:lineRule="auto"/>
+        <w:jc w:val="both"/>
+        <w:rPr>
+          <w:color w:val="262626"/>
+          <w:sz w:val="22"/>
+          <w:szCs w:val="22"/>
+        </w:rPr>
+      </w:pPr>
+    </w:p>
+    <w:p>
+      <w:pPr>
+        <w:spacing w:after="160" w:line="288" w:lineRule="auto"/>
+        <w:jc w:val="both"/>
+        <w:rPr>
+          <w:color w:val="262626"/>
+          <w:sz w:val="22"/>
+          <w:szCs w:val="22"/>
+        </w:rPr>
+      </w:pPr>
+    </w:p>
+    <w:p>
+      <w:pPr>
+        <w:spacing w:after="160" w:line="288" w:lineRule="auto"/>
+        <w:jc w:val="both"/>
+        <w:rPr>
+          <w:color w:val="262626"/>
+          <w:sz w:val="22"/>
+          <w:szCs w:val="22"/>
+        </w:rPr>
+      </w:pPr>
+    </w:p>
+    <w:p>
+      <w:pPr>
+        <w:spacing w:after="160" w:line="288" w:lineRule="auto"/>
+        <w:jc w:val="both"/>
+        <w:rPr>
+          <w:color w:val="262626"/>
+          <w:sz w:val="22"/>
+          <w:szCs w:val="22"/>
+        </w:rPr>
+      </w:pPr>
+    </w:p>
+    <w:p>
+      <w:pPr>
+        <w:spacing w:after="160" w:line="288" w:lineRule="auto"/>
+        <w:jc w:val="both"/>
+      </w:pPr>
     </w:p>
     <w:p>
       <w:pPr>
@@ -3981,6 +4523,7 @@
           <w:bottom w:val="single" w:sz="6" w:space="4" w:color="0E7C7B"/>
         </w:pBdr>
         <w:spacing w:before="320" w:after="160"/>
+        <w:jc w:val="both"/>
       </w:pPr>
       <w:r>
         <w:rPr>
@@ -3990,6 +4533,7 @@
           <w:sz w:val="28"/>
           <w:szCs w:val="28"/>
         </w:rPr>
+        <w:lastRenderedPageBreak/>
         <w:t>5. Dataset and Code Repository</w:t>
       </w:r>
     </w:p>
@@ -4015,7 +4559,7 @@
       <w:r>
         <w:t xml:space="preserve">                               </w:t>
       </w:r>
-      <w:hyperlink r:id="rId7" w:history="1">
+      <w:hyperlink r:id="rId8" w:history="1">
         <w:r>
           <w:rPr>
             <w:rStyle w:val="Hyperlink"/>
@@ -4041,29 +4585,12 @@
     </w:p>
     <w:p>
       <w:pPr>
-        <w:spacing w:after="160" w:line="288" w:lineRule="auto"/>
-        <w:jc w:val="both"/>
-      </w:pPr>
-    </w:p>
-    <w:p>
-      <w:pPr>
-        <w:spacing w:after="160" w:line="288" w:lineRule="auto"/>
-        <w:jc w:val="both"/>
-      </w:pPr>
-    </w:p>
-    <w:p>
-      <w:pPr>
-        <w:spacing w:after="160" w:line="288" w:lineRule="auto"/>
-        <w:jc w:val="both"/>
-      </w:pPr>
-    </w:p>
-    <w:p>
-      <w:pPr>
         <w:pStyle w:val="Heading1"/>
         <w:pBdr>
           <w:bottom w:val="single" w:sz="6" w:space="4" w:color="0E7C7B"/>
         </w:pBdr>
         <w:spacing w:before="320" w:after="160"/>
+        <w:jc w:val="both"/>
       </w:pPr>
       <w:r>
         <w:rPr>
@@ -4073,7 +4600,6 @@
           <w:sz w:val="28"/>
           <w:szCs w:val="28"/>
         </w:rPr>
-        <w:lastRenderedPageBreak/>
         <w:t>References</w:t>
       </w:r>
     </w:p>
@@ -4174,7 +4700,6 @@
       </w:r>
     </w:p>
     <w:sectPr>
-      <w:headerReference w:type="default" r:id="rId8"/>
       <w:footerReference w:type="default" r:id="rId9"/>
       <w:pgSz w:w="11906" w:h="16838"/>
       <w:pgMar w:top="1080" w:right="1260" w:bottom="1080" w:left="1260" w:header="708" w:footer="708" w:gutter="0"/>
@@ -4244,7 +4769,6 @@
     </w:r>
     <w:r>
       <w:rPr>
-        <w:noProof/>
         <w:color w:val="595959"/>
         <w:sz w:val="16"/>
         <w:szCs w:val="16"/>
@@ -4293,7 +4817,6 @@
     </w:r>
     <w:r>
       <w:rPr>
-        <w:noProof/>
         <w:color w:val="595959"/>
         <w:sz w:val="16"/>
         <w:szCs w:val="16"/>
@@ -4331,34 +4854,13 @@
 </w:footnotes>
 </file>
 
-<file path=word/header1.xml><?xml version="1.0" encoding="utf-8"?>
-<w:hdr xmlns:wpc="http://schemas.microsoft.com/office/word/2010/wordprocessingCanvas" xmlns:cx="http://schemas.microsoft.com/office/drawing/2014/chartex" xmlns:cx1="http://schemas.microsoft.com/office/drawing/2015/9/8/chartex" xmlns:cx2="http://schemas.microsoft.com/office/drawing/2015/10/21/chartex" xmlns:cx3="http://schemas.microsoft.com/office/drawing/2016/5/9/chartex" xmlns:cx4="http://schemas.microsoft.com/office/drawing/2016/5/10/chartex" xmlns:cx5="http://schemas.microsoft.com/office/drawing/2016/5/11/chartex" xmlns:cx6="http://schemas.microsoft.com/office/drawing/2016/5/12/chartex" xmlns:cx7="http://schemas.microsoft.com/office/drawing/2016/5/13/chartex" xmlns:cx8="http://schemas.microsoft.com/office/drawing/2016/5/14/chartex" xmlns:mc="http://schemas.openxmlformats.org/markup-compatibility/2006" xmlns:aink="http://schemas.microsoft.com/office/drawing/2016/ink" xmlns:am3d="http://schemas.microsoft.com/office/drawing/2017/model3d" xmlns:o="urn:schemas-microsoft-com:office:office" xmlns:oel="http://schemas.microsoft.com/office/2019/extlst" xmlns:r="http://schemas.openxmlformats.org/officeDocument/2006/relationships" xmlns:m="http://schemas.openxmlformats.org/officeDocument/2006/math" xmlns:v="urn:schemas-microsoft-com:vml" xmlns:wp14="http://schemas.microsoft.com/office/word/2010/wordprocessingDrawing" xmlns:wp="http://schemas.openxmlformats.org/drawingml/2006/wordprocessingDrawing" xmlns:w10="urn:schemas-microsoft-com:office:word" xmlns:w="http://schemas.openxmlformats.org/wordprocessingml/2006/main" xmlns:w14="http://schemas.microsoft.com/office/word/2010/wordml" xmlns:w15="http://schemas.microsoft.com/office/word/2012/wordml" xmlns:w16cei="http://schemas.microsoft.com/office/word/2026/wordml/cei" xmlns:w16cex="http://schemas.microsoft.com/office/word/2018/wordml/cex" xmlns:w16cid="http://schemas.microsoft.com/office/word/2016/wordml/cid" xmlns:w16="http://schemas.microsoft.com/office/word/2018/wordml" xmlns:w16du="http://schemas.microsoft.com/office/word/2023/wordml/word16du" xmlns:w16sdtdh="http://schemas.microsoft.com/office/word/2020/wordml/sdtdatahash" xmlns:w16sdtfl="http://schemas.microsoft.com/office/word/2024/wordml/sdtformatlock" xmlns:w16se="http://schemas.microsoft.com/office/word/2015/wordml/symex" xmlns:wpg="http://schemas.microsoft.com/office/word/2010/wordprocessingGroup" xmlns:wpi="http://schemas.microsoft.com/office/word/2010/wordprocessingInk" xmlns:wne="http://schemas.microsoft.com/office/word/2006/wordml" xmlns:wps="http://schemas.microsoft.com/office/word/2010/wordprocessingShape" mc:Ignorable="w14 w15 w16se w16cid w16 w16cex w16sdtdh w16sdtfl w16du wp14">
-  <w:p>
-    <w:pPr>
-      <w:pBdr>
-        <w:bottom w:val="single" w:sz="4" w:space="4" w:color="BFBFBF"/>
-      </w:pBdr>
-      <w:jc w:val="right"/>
-    </w:pPr>
-    <w:r>
-      <w:rPr>
-        <w:color w:val="595959"/>
-        <w:sz w:val="16"/>
-        <w:szCs w:val="16"/>
-      </w:rPr>
-      <w:t>EEI6373 – Performance Modelling | Mini Project Submission</w:t>
-    </w:r>
-  </w:p>
-</w:hdr>
-</file>
-
 <file path=word/numbering.xml><?xml version="1.0" encoding="utf-8"?>
 <w:numbering xmlns:wpc="http://schemas.microsoft.com/office/word/2010/wordprocessingCanvas" xmlns:cx="http://schemas.microsoft.com/office/drawing/2014/chartex" xmlns:cx1="http://schemas.microsoft.com/office/drawing/2015/9/8/chartex" xmlns:cx2="http://schemas.microsoft.com/office/drawing/2015/10/21/chartex" xmlns:cx3="http://schemas.microsoft.com/office/drawing/2016/5/9/chartex" xmlns:cx4="http://schemas.microsoft.com/office/drawing/2016/5/10/chartex" xmlns:cx5="http://schemas.microsoft.com/office/drawing/2016/5/11/chartex" xmlns:cx6="http://schemas.microsoft.com/office/drawing/2016/5/12/chartex" xmlns:cx7="http://schemas.microsoft.com/office/drawing/2016/5/13/chartex" xmlns:cx8="http://schemas.microsoft.com/office/drawing/2016/5/14/chartex" xmlns:mc="http://schemas.openxmlformats.org/markup-compatibility/2006" xmlns:aink="http://schemas.microsoft.com/office/drawing/2016/ink" xmlns:am3d="http://schemas.microsoft.com/office/drawing/2017/model3d" xmlns:o="urn:schemas-microsoft-com:office:office" xmlns:oel="http://schemas.microsoft.com/office/2019/extlst" xmlns:r="http://schemas.openxmlformats.org/officeDocument/2006/relationships" xmlns:m="http://schemas.openxmlformats.org/officeDocument/2006/math" xmlns:v="urn:schemas-microsoft-com:vml" xmlns:wp14="http://schemas.microsoft.com/office/word/2010/wordprocessingDrawing" xmlns:wp="http://schemas.openxmlformats.org/drawingml/2006/wordprocessingDrawing" xmlns:w10="urn:schemas-microsoft-com:office:word" xmlns:w="http://schemas.openxmlformats.org/wordprocessingml/2006/main" xmlns:w14="http://schemas.microsoft.com/office/word/2010/wordml" xmlns:w15="http://schemas.microsoft.com/office/word/2012/wordml" xmlns:w16cei="http://schemas.microsoft.com/office/word/2026/wordml/cei" xmlns:w16cex="http://schemas.microsoft.com/office/word/2018/wordml/cex" xmlns:w16cid="http://schemas.microsoft.com/office/word/2016/wordml/cid" xmlns:w16="http://schemas.microsoft.com/office/word/2018/wordml" xmlns:w16du="http://schemas.microsoft.com/office/word/2023/wordml/word16du" xmlns:w16sdtdh="http://schemas.microsoft.com/office/word/2020/wordml/sdtdatahash" xmlns:w16sdtfl="http://schemas.microsoft.com/office/word/2024/wordml/sdtformatlock" xmlns:w16se="http://schemas.microsoft.com/office/word/2015/wordml/symex" xmlns:wpg="http://schemas.microsoft.com/office/word/2010/wordprocessingGroup" xmlns:wpi="http://schemas.microsoft.com/office/word/2010/wordprocessingInk" xmlns:wne="http://schemas.microsoft.com/office/word/2006/wordml" xmlns:wps="http://schemas.microsoft.com/office/word/2010/wordprocessingShape" mc:Ignorable="w14 w15 w16se w16cid w16 w16cex w16sdtdh w16sdtfl w16du wp14">
   <w:abstractNum w:abstractNumId="0" w15:restartNumberingAfterBreak="0">
     <w:nsid w:val="65D03070"/>
-    <w:multiLevelType w:val="hybridMultilevel"/>
-    <w:tmpl w:val="09EA935C"/>
-    <w:lvl w:ilvl="0" w:tplc="C9009526">
+    <w:multiLevelType w:val="multilevel"/>
+    <w:tmpl w:val="65D03070"/>
+    <w:lvl w:ilvl="0">
       <w:start w:val="1"/>
       <w:numFmt w:val="bullet"/>
       <w:lvlText w:val="•"/>
@@ -4367,140 +4869,48 @@
         <w:ind w:left="420" w:hanging="260"/>
       </w:pPr>
     </w:lvl>
-    <w:lvl w:ilvl="1" w:tplc="7F22DB68">
+    <w:lvl w:ilvl="1">
       <w:numFmt w:val="decimal"/>
       <w:lvlText w:val=""/>
       <w:lvlJc w:val="left"/>
     </w:lvl>
-    <w:lvl w:ilvl="2" w:tplc="D6F27B06">
+    <w:lvl w:ilvl="2">
       <w:numFmt w:val="decimal"/>
       <w:lvlText w:val=""/>
       <w:lvlJc w:val="left"/>
     </w:lvl>
-    <w:lvl w:ilvl="3" w:tplc="12466FB8">
+    <w:lvl w:ilvl="3">
       <w:numFmt w:val="decimal"/>
       <w:lvlText w:val=""/>
       <w:lvlJc w:val="left"/>
     </w:lvl>
-    <w:lvl w:ilvl="4" w:tplc="849CDE58">
+    <w:lvl w:ilvl="4">
       <w:numFmt w:val="decimal"/>
       <w:lvlText w:val=""/>
       <w:lvlJc w:val="left"/>
     </w:lvl>
-    <w:lvl w:ilvl="5" w:tplc="719CDBE8">
+    <w:lvl w:ilvl="5">
       <w:numFmt w:val="decimal"/>
       <w:lvlText w:val=""/>
       <w:lvlJc w:val="left"/>
     </w:lvl>
-    <w:lvl w:ilvl="6" w:tplc="DCF0890C">
+    <w:lvl w:ilvl="6">
       <w:numFmt w:val="decimal"/>
       <w:lvlText w:val=""/>
       <w:lvlJc w:val="left"/>
     </w:lvl>
-    <w:lvl w:ilvl="7" w:tplc="23DC188C">
+    <w:lvl w:ilvl="7">
       <w:numFmt w:val="decimal"/>
       <w:lvlText w:val=""/>
       <w:lvlJc w:val="left"/>
     </w:lvl>
-    <w:lvl w:ilvl="8" w:tplc="F12EFD40">
+    <w:lvl w:ilvl="8">
       <w:numFmt w:val="decimal"/>
       <w:lvlText w:val=""/>
       <w:lvlJc w:val="left"/>
     </w:lvl>
   </w:abstractNum>
-  <w:abstractNum w:abstractNumId="1" w15:restartNumberingAfterBreak="0">
-    <w:nsid w:val="7FE725B2"/>
-    <w:multiLevelType w:val="hybridMultilevel"/>
-    <w:tmpl w:val="5268DE98"/>
-    <w:lvl w:ilvl="0" w:tplc="2DB49E76">
-      <w:start w:val="1"/>
-      <w:numFmt w:val="bullet"/>
-      <w:lvlText w:val="●"/>
-      <w:lvlJc w:val="left"/>
-      <w:pPr>
-        <w:ind w:left="720" w:hanging="360"/>
-      </w:pPr>
-    </w:lvl>
-    <w:lvl w:ilvl="1" w:tplc="AFC22FB6">
-      <w:start w:val="1"/>
-      <w:numFmt w:val="bullet"/>
-      <w:lvlText w:val="○"/>
-      <w:lvlJc w:val="left"/>
-      <w:pPr>
-        <w:ind w:left="1440" w:hanging="360"/>
-      </w:pPr>
-    </w:lvl>
-    <w:lvl w:ilvl="2" w:tplc="B7D87F38">
-      <w:start w:val="1"/>
-      <w:numFmt w:val="bullet"/>
-      <w:lvlText w:val="■"/>
-      <w:lvlJc w:val="left"/>
-      <w:pPr>
-        <w:ind w:left="2160" w:hanging="360"/>
-      </w:pPr>
-    </w:lvl>
-    <w:lvl w:ilvl="3" w:tplc="E7AE916A">
-      <w:start w:val="1"/>
-      <w:numFmt w:val="bullet"/>
-      <w:lvlText w:val="●"/>
-      <w:lvlJc w:val="left"/>
-      <w:pPr>
-        <w:ind w:left="2880" w:hanging="360"/>
-      </w:pPr>
-    </w:lvl>
-    <w:lvl w:ilvl="4" w:tplc="1ED067E8">
-      <w:start w:val="1"/>
-      <w:numFmt w:val="bullet"/>
-      <w:lvlText w:val="○"/>
-      <w:lvlJc w:val="left"/>
-      <w:pPr>
-        <w:ind w:left="3600" w:hanging="360"/>
-      </w:pPr>
-    </w:lvl>
-    <w:lvl w:ilvl="5" w:tplc="89AAD3E6">
-      <w:start w:val="1"/>
-      <w:numFmt w:val="bullet"/>
-      <w:lvlText w:val="■"/>
-      <w:lvlJc w:val="left"/>
-      <w:pPr>
-        <w:ind w:left="4320" w:hanging="360"/>
-      </w:pPr>
-    </w:lvl>
-    <w:lvl w:ilvl="6" w:tplc="D744E6CE">
-      <w:start w:val="1"/>
-      <w:numFmt w:val="bullet"/>
-      <w:lvlText w:val="●"/>
-      <w:lvlJc w:val="left"/>
-      <w:pPr>
-        <w:ind w:left="5040" w:hanging="360"/>
-      </w:pPr>
-    </w:lvl>
-    <w:lvl w:ilvl="7" w:tplc="219A580C">
-      <w:start w:val="1"/>
-      <w:numFmt w:val="bullet"/>
-      <w:lvlText w:val="●"/>
-      <w:lvlJc w:val="left"/>
-      <w:pPr>
-        <w:ind w:left="5760" w:hanging="360"/>
-      </w:pPr>
-    </w:lvl>
-    <w:lvl w:ilvl="8" w:tplc="2DC2B062">
-      <w:start w:val="1"/>
-      <w:numFmt w:val="bullet"/>
-      <w:lvlText w:val="●"/>
-      <w:lvlJc w:val="left"/>
-      <w:pPr>
-        <w:ind w:left="6480" w:hanging="360"/>
-      </w:pPr>
-    </w:lvl>
-  </w:abstractNum>
-  <w:num w:numId="1" w16cid:durableId="1775057593">
-    <w:abstractNumId w:val="1"/>
-    <w:lvlOverride w:ilvl="0">
-      <w:startOverride w:val="1"/>
-    </w:lvlOverride>
-  </w:num>
-  <w:num w:numId="2" w16cid:durableId="359092165">
+  <w:num w:numId="1" w16cid:durableId="1730036126">
     <w:abstractNumId w:val="0"/>
     <w:lvlOverride w:ilvl="0">
       <w:startOverride w:val="1"/>
@@ -4515,7 +4925,7 @@
     <w:rPrDefault>
       <w:rPr>
         <w:rFonts w:ascii="Times New Roman" w:eastAsia="Times New Roman" w:hAnsi="Times New Roman" w:cs="Times New Roman"/>
-        <w:lang w:val="en-US" w:eastAsia="en-US" w:bidi="ar-SA"/>
+        <w:lang w:val="en-GB" w:eastAsia="en-GB" w:bidi="ar-SA"/>
       </w:rPr>
     </w:rPrDefault>
     <w:pPrDefault/>
@@ -4523,7 +4933,7 @@
   <w:latentStyles w:defLockedState="0" w:defUIPriority="99" w:defSemiHidden="0" w:defUnhideWhenUsed="0" w:defQFormat="0" w:count="376">
     <w:lsdException w:name="Normal" w:uiPriority="0" w:qFormat="1"/>
     <w:lsdException w:name="heading 1" w:uiPriority="9" w:qFormat="1"/>
-    <w:lsdException w:name="heading 2" w:semiHidden="1" w:uiPriority="9" w:unhideWhenUsed="1" w:qFormat="1"/>
+    <w:lsdException w:name="heading 2" w:uiPriority="9" w:unhideWhenUsed="1" w:qFormat="1"/>
     <w:lsdException w:name="heading 3" w:semiHidden="1" w:uiPriority="9" w:unhideWhenUsed="1" w:qFormat="1"/>
     <w:lsdException w:name="heading 4" w:semiHidden="1" w:uiPriority="9" w:unhideWhenUsed="1" w:qFormat="1"/>
     <w:lsdException w:name="heading 5" w:semiHidden="1" w:uiPriority="9" w:unhideWhenUsed="1" w:qFormat="1"/>
@@ -4552,8 +4962,8 @@
     <w:lsdException w:name="Normal Indent" w:semiHidden="1" w:unhideWhenUsed="1"/>
     <w:lsdException w:name="footnote text" w:semiHidden="1" w:unhideWhenUsed="1"/>
     <w:lsdException w:name="annotation text" w:semiHidden="1" w:unhideWhenUsed="1"/>
-    <w:lsdException w:name="header" w:semiHidden="1" w:unhideWhenUsed="1"/>
-    <w:lsdException w:name="footer" w:semiHidden="1" w:unhideWhenUsed="1"/>
+    <w:lsdException w:name="header" w:unhideWhenUsed="1"/>
+    <w:lsdException w:name="footer" w:unhideWhenUsed="1"/>
     <w:lsdException w:name="index heading" w:semiHidden="1" w:unhideWhenUsed="1"/>
     <w:lsdException w:name="caption" w:semiHidden="1" w:uiPriority="35" w:unhideWhenUsed="1" w:qFormat="1"/>
     <w:lsdException w:name="table of figures" w:semiHidden="1" w:unhideWhenUsed="1"/>
@@ -4586,7 +4996,7 @@
     <w:lsdException w:name="Title" w:uiPriority="10" w:qFormat="1"/>
     <w:lsdException w:name="Closing" w:semiHidden="1" w:unhideWhenUsed="1"/>
     <w:lsdException w:name="Signature" w:semiHidden="1" w:unhideWhenUsed="1"/>
-    <w:lsdException w:name="Default Paragraph Font" w:semiHidden="1" w:uiPriority="1" w:unhideWhenUsed="1"/>
+    <w:lsdException w:name="Default Paragraph Font" w:semiHidden="1" w:uiPriority="1" w:unhideWhenUsed="1" w:qFormat="1"/>
     <w:lsdException w:name="Body Text" w:semiHidden="1" w:unhideWhenUsed="1"/>
     <w:lsdException w:name="Body Text Indent" w:semiHidden="1" w:unhideWhenUsed="1"/>
     <w:lsdException w:name="List Continue" w:semiHidden="1" w:unhideWhenUsed="1"/>
@@ -4606,7 +5016,7 @@
     <w:lsdException w:name="Body Text Indent 2" w:semiHidden="1" w:unhideWhenUsed="1"/>
     <w:lsdException w:name="Body Text Indent 3" w:semiHidden="1" w:unhideWhenUsed="1"/>
     <w:lsdException w:name="Block Text" w:semiHidden="1" w:unhideWhenUsed="1"/>
-    <w:lsdException w:name="Hyperlink" w:semiHidden="1" w:unhideWhenUsed="1"/>
+    <w:lsdException w:name="Hyperlink" w:unhideWhenUsed="1"/>
     <w:lsdException w:name="FollowedHyperlink" w:semiHidden="1" w:unhideWhenUsed="1"/>
     <w:lsdException w:name="Strong" w:uiPriority="22" w:qFormat="1"/>
     <w:lsdException w:name="Emphasis" w:uiPriority="20" w:qFormat="1"/>
@@ -4626,7 +5036,7 @@
     <w:lsdException w:name="HTML Sample" w:semiHidden="1" w:unhideWhenUsed="1"/>
     <w:lsdException w:name="HTML Typewriter" w:semiHidden="1" w:unhideWhenUsed="1"/>
     <w:lsdException w:name="HTML Variable" w:semiHidden="1" w:unhideWhenUsed="1"/>
-    <w:lsdException w:name="Normal Table" w:semiHidden="1" w:unhideWhenUsed="1"/>
+    <w:lsdException w:name="Normal Table" w:semiHidden="1" w:unhideWhenUsed="1" w:qFormat="1"/>
     <w:lsdException w:name="annotation subject" w:semiHidden="1" w:unhideWhenUsed="1"/>
     <w:lsdException w:name="No List" w:semiHidden="1" w:unhideWhenUsed="1"/>
     <w:lsdException w:name="Outline List 1" w:semiHidden="1" w:unhideWhenUsed="1"/>
@@ -4677,8 +5087,8 @@
     <w:lsdException w:name="Balloon Text" w:semiHidden="1" w:unhideWhenUsed="1"/>
     <w:lsdException w:name="Table Grid" w:uiPriority="39"/>
     <w:lsdException w:name="Table Theme" w:semiHidden="1" w:unhideWhenUsed="1"/>
-    <w:lsdException w:name="Placeholder Text" w:semiHidden="1"/>
-    <w:lsdException w:name="No Spacing" w:uiPriority="1" w:qFormat="1"/>
+    <w:lsdException w:name="Placeholder Text" w:semiHidden="1" w:unhideWhenUsed="1"/>
+    <w:lsdException w:name="No Spacing" w:semiHidden="1" w:unhideWhenUsed="1"/>
     <w:lsdException w:name="Light Shading" w:uiPriority="60"/>
     <w:lsdException w:name="Light List" w:uiPriority="61"/>
     <w:lsdException w:name="Light Grid" w:uiPriority="62"/>
@@ -4699,10 +5109,10 @@
     <w:lsdException w:name="Medium Shading 1 Accent 1" w:uiPriority="63"/>
     <w:lsdException w:name="Medium Shading 2 Accent 1" w:uiPriority="64"/>
     <w:lsdException w:name="Medium List 1 Accent 1" w:uiPriority="65"/>
-    <w:lsdException w:name="Revision" w:semiHidden="1"/>
-    <w:lsdException w:name="List Paragraph" w:uiPriority="34" w:qFormat="1"/>
-    <w:lsdException w:name="Quote" w:uiPriority="29" w:qFormat="1"/>
-    <w:lsdException w:name="Intense Quote" w:uiPriority="30" w:qFormat="1"/>
+    <w:lsdException w:name="Revision" w:semiHidden="1" w:unhideWhenUsed="1"/>
+    <w:lsdException w:name="List Paragraph" w:uiPriority="0" w:qFormat="1"/>
+    <w:lsdException w:name="Quote" w:semiHidden="1" w:unhideWhenUsed="1"/>
+    <w:lsdException w:name="Intense Quote" w:semiHidden="1" w:unhideWhenUsed="1"/>
     <w:lsdException w:name="Medium List 2 Accent 1" w:uiPriority="66"/>
     <w:lsdException w:name="Medium Grid 1 Accent 1" w:uiPriority="67"/>
     <w:lsdException w:name="Medium Grid 2 Accent 1" w:uiPriority="68"/>
@@ -4901,6 +5311,9 @@
   <w:style w:type="paragraph" w:default="1" w:styleId="Normal">
     <w:name w:val="Normal"/>
     <w:qFormat/>
+    <w:rPr>
+      <w:lang w:val="en-US" w:eastAsia="en-US"/>
+    </w:rPr>
   </w:style>
   <w:style w:type="paragraph" w:styleId="Heading1">
     <w:name w:val="heading 1"/>
@@ -4913,6 +5326,7 @@
       <w:color w:val="2E74B5"/>
       <w:sz w:val="32"/>
       <w:szCs w:val="32"/>
+      <w:lang w:val="en-US" w:eastAsia="en-US"/>
     </w:rPr>
   </w:style>
   <w:style w:type="paragraph" w:styleId="Heading2">
@@ -4927,6 +5341,7 @@
       <w:color w:val="2E74B5"/>
       <w:sz w:val="26"/>
       <w:szCs w:val="26"/>
+      <w:lang w:val="en-US" w:eastAsia="en-US"/>
     </w:rPr>
   </w:style>
   <w:style w:type="paragraph" w:styleId="Heading3">
@@ -4942,6 +5357,7 @@
       <w:color w:val="1F4D78"/>
       <w:sz w:val="24"/>
       <w:szCs w:val="24"/>
+      <w:lang w:val="en-US" w:eastAsia="en-US"/>
     </w:rPr>
   </w:style>
   <w:style w:type="paragraph" w:styleId="Heading4">
@@ -4957,6 +5373,7 @@
       <w:i/>
       <w:iCs/>
       <w:color w:val="2E74B5"/>
+      <w:lang w:val="en-US" w:eastAsia="en-US"/>
     </w:rPr>
   </w:style>
   <w:style w:type="paragraph" w:styleId="Heading5">
@@ -4970,6 +5387,7 @@
     </w:pPr>
     <w:rPr>
       <w:color w:val="2E74B5"/>
+      <w:lang w:val="en-US" w:eastAsia="en-US"/>
     </w:rPr>
   </w:style>
   <w:style w:type="paragraph" w:styleId="Heading6">
@@ -4983,12 +5401,12 @@
     </w:pPr>
     <w:rPr>
       <w:color w:val="1F4D78"/>
+      <w:lang w:val="en-US" w:eastAsia="en-US"/>
     </w:rPr>
   </w:style>
   <w:style w:type="character" w:default="1" w:styleId="DefaultParagraphFont">
     <w:name w:val="Default Paragraph Font"/>
     <w:uiPriority w:val="1"/>
-    <w:semiHidden/>
     <w:unhideWhenUsed/>
   </w:style>
   <w:style w:type="table" w:default="1" w:styleId="TableNormal">
@@ -5012,35 +5430,37 @@
     <w:semiHidden/>
     <w:unhideWhenUsed/>
   </w:style>
-  <w:style w:type="paragraph" w:styleId="Title">
-    <w:name w:val="Title"/>
-    <w:uiPriority w:val="10"/>
-    <w:qFormat/>
+  <w:style w:type="character" w:styleId="EndnoteReference">
+    <w:name w:val="endnote reference"/>
+    <w:uiPriority w:val="99"/>
+    <w:semiHidden/>
+    <w:unhideWhenUsed/>
     <w:rPr>
-      <w:sz w:val="56"/>
-      <w:szCs w:val="56"/>
+      <w:vertAlign w:val="superscript"/>
     </w:rPr>
   </w:style>
-  <w:style w:type="paragraph" w:customStyle="1" w:styleId="Strong1">
-    <w:name w:val="Strong1"/>
-    <w:qFormat/>
+  <w:style w:type="paragraph" w:styleId="EndnoteText">
+    <w:name w:val="endnote text"/>
+    <w:link w:val="EndnoteTextChar"/>
+    <w:uiPriority w:val="99"/>
+    <w:semiHidden/>
+    <w:unhideWhenUsed/>
     <w:rPr>
-      <w:b/>
-      <w:bCs/>
+      <w:lang w:val="en-US" w:eastAsia="en-US"/>
     </w:rPr>
   </w:style>
-  <w:style w:type="paragraph" w:styleId="ListParagraph">
-    <w:name w:val="List Paragraph"/>
-    <w:qFormat/>
-  </w:style>
-  <w:style w:type="character" w:styleId="Hyperlink">
-    <w:name w:val="Hyperlink"/>
+  <w:style w:type="paragraph" w:styleId="Footer">
+    <w:name w:val="footer"/>
+    <w:basedOn w:val="Normal"/>
+    <w:link w:val="FooterChar"/>
     <w:uiPriority w:val="99"/>
     <w:unhideWhenUsed/>
-    <w:rPr>
-      <w:color w:val="0563C1"/>
-      <w:u w:val="single"/>
-    </w:rPr>
+    <w:pPr>
+      <w:tabs>
+        <w:tab w:val="center" w:pos="4680"/>
+        <w:tab w:val="right" w:pos="9360"/>
+      </w:tabs>
+    </w:pPr>
   </w:style>
   <w:style w:type="character" w:styleId="FootnoteReference">
     <w:name w:val="footnote reference"/>
@@ -5057,6 +5477,57 @@
     <w:uiPriority w:val="99"/>
     <w:semiHidden/>
     <w:unhideWhenUsed/>
+    <w:rPr>
+      <w:lang w:val="en-US" w:eastAsia="en-US"/>
+    </w:rPr>
+  </w:style>
+  <w:style w:type="paragraph" w:styleId="Header">
+    <w:name w:val="header"/>
+    <w:basedOn w:val="Normal"/>
+    <w:link w:val="HeaderChar"/>
+    <w:uiPriority w:val="99"/>
+    <w:unhideWhenUsed/>
+    <w:pPr>
+      <w:tabs>
+        <w:tab w:val="center" w:pos="4680"/>
+        <w:tab w:val="right" w:pos="9360"/>
+      </w:tabs>
+    </w:pPr>
+  </w:style>
+  <w:style w:type="character" w:styleId="Hyperlink">
+    <w:name w:val="Hyperlink"/>
+    <w:uiPriority w:val="99"/>
+    <w:unhideWhenUsed/>
+    <w:rPr>
+      <w:color w:val="0563C1"/>
+      <w:u w:val="single"/>
+    </w:rPr>
+  </w:style>
+  <w:style w:type="paragraph" w:styleId="Title">
+    <w:name w:val="Title"/>
+    <w:uiPriority w:val="10"/>
+    <w:qFormat/>
+    <w:rPr>
+      <w:sz w:val="56"/>
+      <w:szCs w:val="56"/>
+      <w:lang w:val="en-US" w:eastAsia="en-US"/>
+    </w:rPr>
+  </w:style>
+  <w:style w:type="paragraph" w:customStyle="1" w:styleId="Strong1">
+    <w:name w:val="Strong1"/>
+    <w:qFormat/>
+    <w:rPr>
+      <w:b/>
+      <w:bCs/>
+      <w:lang w:val="en-US" w:eastAsia="en-US"/>
+    </w:rPr>
+  </w:style>
+  <w:style w:type="paragraph" w:styleId="ListParagraph">
+    <w:name w:val="List Paragraph"/>
+    <w:qFormat/>
+    <w:rPr>
+      <w:lang w:val="en-US" w:eastAsia="en-US"/>
+    </w:rPr>
   </w:style>
   <w:style w:type="character" w:customStyle="1" w:styleId="FootnoteTextChar">
     <w:name w:val="Footnote Text Char"/>
@@ -5069,22 +5540,6 @@
       <w:szCs w:val="20"/>
     </w:rPr>
   </w:style>
-  <w:style w:type="character" w:styleId="EndnoteReference">
-    <w:name w:val="endnote reference"/>
-    <w:uiPriority w:val="99"/>
-    <w:semiHidden/>
-    <w:unhideWhenUsed/>
-    <w:rPr>
-      <w:vertAlign w:val="superscript"/>
-    </w:rPr>
-  </w:style>
-  <w:style w:type="paragraph" w:styleId="EndnoteText">
-    <w:name w:val="endnote text"/>
-    <w:link w:val="EndnoteTextChar"/>
-    <w:uiPriority w:val="99"/>
-    <w:semiHidden/>
-    <w:unhideWhenUsed/>
-  </w:style>
   <w:style w:type="character" w:customStyle="1" w:styleId="EndnoteTextChar">
     <w:name w:val="Endnote Text Char"/>
     <w:link w:val="EndnoteText"/>
@@ -5096,17 +5551,28 @@
       <w:szCs w:val="20"/>
     </w:rPr>
   </w:style>
-  <w:style w:type="character" w:styleId="UnresolvedMention">
-    <w:name w:val="Unresolved Mention"/>
+  <w:style w:type="character" w:customStyle="1" w:styleId="UnresolvedMention1">
+    <w:name w:val="Unresolved Mention1"/>
     <w:basedOn w:val="DefaultParagraphFont"/>
     <w:uiPriority w:val="99"/>
     <w:semiHidden/>
     <w:unhideWhenUsed/>
-    <w:rsid w:val="00BF7C73"/>
     <w:rPr>
       <w:color w:val="605E5C"/>
       <w:shd w:val="clear" w:color="auto" w:fill="E1DFDD"/>
     </w:rPr>
+  </w:style>
+  <w:style w:type="character" w:customStyle="1" w:styleId="HeaderChar">
+    <w:name w:val="Header Char"/>
+    <w:basedOn w:val="DefaultParagraphFont"/>
+    <w:link w:val="Header"/>
+    <w:uiPriority w:val="99"/>
+  </w:style>
+  <w:style w:type="character" w:customStyle="1" w:styleId="FooterChar">
+    <w:name w:val="Footer Char"/>
+    <w:basedOn w:val="DefaultParagraphFont"/>
+    <w:link w:val="Footer"/>
+    <w:uiPriority w:val="99"/>
   </w:style>
 </w:styles>
 </file>
@@ -5154,7 +5620,7 @@
     </a:clrScheme>
     <a:fontScheme name="Office">
       <a:majorFont>
-        <a:latin typeface="Calibri Light" panose="020F0302020204030204"/>
+        <a:latin typeface="Calibri Light"/>
         <a:ea typeface=""/>
         <a:cs typeface=""/>
         <a:font script="Jpan" typeface="游ゴシック Light"/>
@@ -5187,26 +5653,9 @@
         <a:font script="Viet" typeface="Times New Roman"/>
         <a:font script="Uigh" typeface="Microsoft Uighur"/>
         <a:font script="Geor" typeface="Sylfaen"/>
-        <a:font script="Armn" typeface="Arial"/>
-        <a:font script="Bugi" typeface="Leelawadee UI"/>
-        <a:font script="Bopo" typeface="Microsoft JhengHei"/>
-        <a:font script="Java" typeface="Javanese Text"/>
-        <a:font script="Lisu" typeface="Segoe UI"/>
-        <a:font script="Mymr" typeface="Myanmar Text"/>
-        <a:font script="Nkoo" typeface="Ebrima"/>
-        <a:font script="Olck" typeface="Nirmala UI"/>
-        <a:font script="Osma" typeface="Ebrima"/>
-        <a:font script="Phag" typeface="Phagspa"/>
-        <a:font script="Syrn" typeface="Estrangelo Edessa"/>
-        <a:font script="Syrj" typeface="Estrangelo Edessa"/>
-        <a:font script="Syre" typeface="Estrangelo Edessa"/>
-        <a:font script="Sora" typeface="Nirmala UI"/>
-        <a:font script="Tale" typeface="Microsoft Tai Le"/>
-        <a:font script="Talu" typeface="Microsoft New Tai Lue"/>
-        <a:font script="Tfng" typeface="Ebrima"/>
       </a:majorFont>
       <a:minorFont>
-        <a:latin typeface="Calibri" panose="020F0502020204030204"/>
+        <a:latin typeface="Calibri"/>
         <a:ea typeface=""/>
         <a:cs typeface=""/>
         <a:font script="Jpan" typeface="游明朝"/>
@@ -5239,23 +5688,6 @@
         <a:font script="Viet" typeface="Arial"/>
         <a:font script="Uigh" typeface="Microsoft Uighur"/>
         <a:font script="Geor" typeface="Sylfaen"/>
-        <a:font script="Armn" typeface="Arial"/>
-        <a:font script="Bugi" typeface="Leelawadee UI"/>
-        <a:font script="Bopo" typeface="Microsoft JhengHei"/>
-        <a:font script="Java" typeface="Javanese Text"/>
-        <a:font script="Lisu" typeface="Segoe UI"/>
-        <a:font script="Mymr" typeface="Myanmar Text"/>
-        <a:font script="Nkoo" typeface="Ebrima"/>
-        <a:font script="Olck" typeface="Nirmala UI"/>
-        <a:font script="Osma" typeface="Ebrima"/>
-        <a:font script="Phag" typeface="Phagspa"/>
-        <a:font script="Syrn" typeface="Estrangelo Edessa"/>
-        <a:font script="Syrj" typeface="Estrangelo Edessa"/>
-        <a:font script="Syre" typeface="Estrangelo Edessa"/>
-        <a:font script="Sora" typeface="Nirmala UI"/>
-        <a:font script="Tale" typeface="Microsoft Tai Le"/>
-        <a:font script="Talu" typeface="Microsoft New Tai Lue"/>
-        <a:font script="Tfng" typeface="Ebrima"/>
       </a:minorFont>
     </a:fontScheme>
     <a:fmtScheme name="Office">
@@ -5398,10 +5830,5 @@
   </a:themeElements>
   <a:objectDefaults/>
   <a:extraClrSchemeLst/>
-  <a:extLst>
-    <a:ext uri="{05A4C25C-085E-4340-85A3-A5531E510DB2}">
-      <thm15:themeFamily xmlns:thm15="http://schemas.microsoft.com/office/thememl/2012/main" name="Office Theme" id="{62F939B6-93AF-4DB8-9C6B-D6C7DFDC589F}" vid="{4A3C46E8-61CC-4603-A589-7422A47A8E4A}"/>
-    </a:ext>
-  </a:extLst>
 </a:theme>
 </file>
</xml_diff>